<commit_message>
feat: actualizar estructura del menú lateral y agregar nuevos módulos en la documentación de sistemas
</commit_message>
<xml_diff>
--- a/docs/modulos-y-submodulos-sistemas.docx
+++ b/docs/modulos-y-submodulos-sistemas.docx
@@ -4451,12 +4451,11 @@
       <w:tblPr>
         <w:tblStyle w:val="TableGrid"/>
         <w:tblW w:type="auto" w:w="0"/>
-        <w:tblLayout w:type="fixed"/>
         <w:tblLook w:firstColumn="1" w:firstRow="1" w:lastColumn="0" w:lastRow="0" w:noHBand="0" w:noVBand="1" w:val="04A0"/>
       </w:tblPr>
       <w:tblGrid>
-        <w:gridCol w:w="2016"/>
-        <w:gridCol w:w="7200"/>
+        <w:gridCol w:w="4680"/>
+        <w:gridCol w:w="4680"/>
       </w:tblGrid>
       <w:tr>
         <w:tc>
@@ -4464,12 +4463,9 @@
             <w:tcW w:type="dxa" w:w="4680"/>
           </w:tcPr>
           <w:p>
-            <w:r/>
             <w:r>
               <w:rPr>
-                <w:rFonts w:ascii="Calibri" w:hAnsi="Calibri"/>
                 <w:b/>
-                <w:sz w:val="20"/>
               </w:rPr>
               <w:t>Sistema</w:t>
             </w:r>
@@ -4480,12 +4476,9 @@
             <w:tcW w:type="dxa" w:w="4680"/>
           </w:tcPr>
           <w:p>
-            <w:r/>
             <w:r>
               <w:rPr>
-                <w:rFonts w:ascii="Calibri" w:hAnsi="Calibri"/>
                 <w:b/>
-                <w:sz w:val="20"/>
               </w:rPr>
               <w:t>Responsabilidad principal</w:t>
             </w:r>
@@ -4495,15 +4488,12 @@
       <w:tr>
         <w:tc>
           <w:tcPr>
-            <w:tcW w:type="dxa" w:w="2016"/>
+            <w:tcW w:type="dxa" w:w="4680"/>
           </w:tcPr>
           <w:p>
-            <w:r/>
             <w:r>
               <w:rPr>
-                <w:rFonts w:ascii="Calibri" w:hAnsi="Calibri"/>
                 <w:b/>
-                <w:sz w:val="20"/>
               </w:rPr>
               <w:t>ERP</w:t>
             </w:r>
@@ -4511,16 +4501,10 @@
         </w:tc>
         <w:tc>
           <w:tcPr>
-            <w:tcW w:type="dxa" w:w="7200"/>
+            <w:tcW w:type="dxa" w:w="4680"/>
           </w:tcPr>
           <w:p>
-            <w:r/>
             <w:r>
-              <w:rPr>
-                <w:rFonts w:ascii="Calibri" w:hAnsi="Calibri"/>
-                <w:b w:val="0"/>
-                <w:sz w:val="20"/>
-              </w:rPr>
               <w:t>Negocio, finanzas, compras, ventas y administracion</w:t>
             </w:r>
           </w:p>
@@ -4529,15 +4513,12 @@
       <w:tr>
         <w:tc>
           <w:tcPr>
-            <w:tcW w:type="dxa" w:w="2016"/>
+            <w:tcW w:type="dxa" w:w="4680"/>
           </w:tcPr>
           <w:p>
-            <w:r/>
             <w:r>
               <w:rPr>
-                <w:rFonts w:ascii="Calibri" w:hAnsi="Calibri"/>
                 <w:b/>
-                <w:sz w:val="20"/>
               </w:rPr>
               <w:t>WMS</w:t>
             </w:r>
@@ -4545,16 +4526,10 @@
         </w:tc>
         <w:tc>
           <w:tcPr>
-            <w:tcW w:type="dxa" w:w="7200"/>
+            <w:tcW w:type="dxa" w:w="4680"/>
           </w:tcPr>
           <w:p>
-            <w:r/>
             <w:r>
-              <w:rPr>
-                <w:rFonts w:ascii="Calibri" w:hAnsi="Calibri"/>
-                <w:b w:val="0"/>
-                <w:sz w:val="20"/>
-              </w:rPr>
               <w:t>Almacen, inventario operativo y ejecucion logistica interna</w:t>
             </w:r>
           </w:p>
@@ -4563,15 +4538,12 @@
       <w:tr>
         <w:tc>
           <w:tcPr>
-            <w:tcW w:type="dxa" w:w="2016"/>
+            <w:tcW w:type="dxa" w:w="4680"/>
           </w:tcPr>
           <w:p>
-            <w:r/>
             <w:r>
               <w:rPr>
-                <w:rFonts w:ascii="Calibri" w:hAnsi="Calibri"/>
                 <w:b/>
-                <w:sz w:val="20"/>
               </w:rPr>
               <w:t>TMS</w:t>
             </w:r>
@@ -4579,16 +4551,10 @@
         </w:tc>
         <w:tc>
           <w:tcPr>
-            <w:tcW w:type="dxa" w:w="7200"/>
+            <w:tcW w:type="dxa" w:w="4680"/>
           </w:tcPr>
           <w:p>
-            <w:r/>
             <w:r>
-              <w:rPr>
-                <w:rFonts w:ascii="Calibri" w:hAnsi="Calibri"/>
-                <w:b w:val="0"/>
-                <w:sz w:val="20"/>
-              </w:rPr>
               <w:t>Transporte, rutas, flota, entregas y distribucion</w:t>
             </w:r>
           </w:p>
@@ -4597,15 +4563,12 @@
       <w:tr>
         <w:tc>
           <w:tcPr>
-            <w:tcW w:type="dxa" w:w="2016"/>
+            <w:tcW w:type="dxa" w:w="4680"/>
           </w:tcPr>
           <w:p>
-            <w:r/>
             <w:r>
               <w:rPr>
-                <w:rFonts w:ascii="Calibri" w:hAnsi="Calibri"/>
                 <w:b/>
-                <w:sz w:val="20"/>
               </w:rPr>
               <w:t>DMS</w:t>
             </w:r>
@@ -4613,16 +4576,10 @@
         </w:tc>
         <w:tc>
           <w:tcPr>
-            <w:tcW w:type="dxa" w:w="7200"/>
+            <w:tcW w:type="dxa" w:w="4680"/>
           </w:tcPr>
           <w:p>
-            <w:r/>
             <w:r>
-              <w:rPr>
-                <w:rFonts w:ascii="Calibri" w:hAnsi="Calibri"/>
-                <w:b w:val="0"/>
-                <w:sz w:val="20"/>
-              </w:rPr>
               <w:t>Documentos, versiones, aprobaciones, firma y archivo</w:t>
             </w:r>
           </w:p>
@@ -4631,15 +4588,12 @@
       <w:tr>
         <w:tc>
           <w:tcPr>
-            <w:tcW w:type="dxa" w:w="2016"/>
+            <w:tcW w:type="dxa" w:w="4680"/>
           </w:tcPr>
           <w:p>
-            <w:r/>
             <w:r>
               <w:rPr>
-                <w:rFonts w:ascii="Calibri" w:hAnsi="Calibri"/>
                 <w:b/>
-                <w:sz w:val="20"/>
               </w:rPr>
               <w:t>RRHH</w:t>
             </w:r>
@@ -4647,16 +4601,10 @@
         </w:tc>
         <w:tc>
           <w:tcPr>
-            <w:tcW w:type="dxa" w:w="7200"/>
+            <w:tcW w:type="dxa" w:w="4680"/>
           </w:tcPr>
           <w:p>
-            <w:r/>
             <w:r>
-              <w:rPr>
-                <w:rFonts w:ascii="Calibri" w:hAnsi="Calibri"/>
-                <w:b w:val="0"/>
-                <w:sz w:val="20"/>
-              </w:rPr>
               <w:t>Empleados, asistencia, nomina, desempeno y portales</w:t>
             </w:r>
           </w:p>
@@ -4729,7 +4677,7 @@
     </w:p>
     <w:p>
       <w:r>
-        <w:t>Esta estructura sirve como base para organizar el menu lateral de la plataforma. El sidebar debe mostrar primero los modulos operativos y dejar los catalogos, reglas y parametros dentro de Configuraciones.</w:t>
+        <w:t>Esta estructura sirve como base para organizar el menu lateral de la plataforma. El sidebar debe mostrar primero los modulos operativos y dejar los catalogos, reglas, estados, motivos y parametros dentro de Configuraciones.</w:t>
       </w:r>
     </w:p>
     <w:p>
@@ -4750,6 +4698,69 @@
     </w:p>
     <w:p>
       <w:pPr>
+        <w:pStyle w:val="ListBullet2"/>
+        <w:ind w:left="720"/>
+      </w:pPr>
+      <w:r>
+        <w:t>Contabilidad general</w:t>
+      </w:r>
+    </w:p>
+    <w:p>
+      <w:pPr>
+        <w:pStyle w:val="ListBullet2"/>
+        <w:ind w:left="720"/>
+      </w:pPr>
+      <w:r>
+        <w:t>Plan contable</w:t>
+      </w:r>
+    </w:p>
+    <w:p>
+      <w:pPr>
+        <w:pStyle w:val="ListBullet2"/>
+        <w:ind w:left="720"/>
+      </w:pPr>
+      <w:r>
+        <w:t>Cuentas por cobrar</w:t>
+      </w:r>
+    </w:p>
+    <w:p>
+      <w:pPr>
+        <w:pStyle w:val="ListBullet2"/>
+        <w:ind w:left="720"/>
+      </w:pPr>
+      <w:r>
+        <w:t>Cuentas por pagar</w:t>
+      </w:r>
+    </w:p>
+    <w:p>
+      <w:pPr>
+        <w:pStyle w:val="ListBullet2"/>
+        <w:ind w:left="720"/>
+      </w:pPr>
+      <w:r>
+        <w:t>Activos fijos</w:t>
+      </w:r>
+    </w:p>
+    <w:p>
+      <w:pPr>
+        <w:pStyle w:val="ListBullet2"/>
+        <w:ind w:left="720"/>
+      </w:pPr>
+      <w:r>
+        <w:t>Cierres contables</w:t>
+      </w:r>
+    </w:p>
+    <w:p>
+      <w:pPr>
+        <w:pStyle w:val="ListBullet2"/>
+        <w:ind w:left="720"/>
+      </w:pPr>
+      <w:r>
+        <w:t>Estados financieros</w:t>
+      </w:r>
+    </w:p>
+    <w:p>
+      <w:pPr>
         <w:pStyle w:val="ListBullet"/>
       </w:pPr>
       <w:r>
@@ -4758,6 +4769,87 @@
     </w:p>
     <w:p>
       <w:pPr>
+        <w:pStyle w:val="ListBullet2"/>
+        <w:ind w:left="720"/>
+      </w:pPr>
+      <w:r>
+        <w:t>Cotizaciones</w:t>
+      </w:r>
+    </w:p>
+    <w:p>
+      <w:pPr>
+        <w:pStyle w:val="ListBullet2"/>
+        <w:ind w:left="720"/>
+      </w:pPr>
+      <w:r>
+        <w:t>Pedidos de venta</w:t>
+      </w:r>
+    </w:p>
+    <w:p>
+      <w:pPr>
+        <w:pStyle w:val="ListBullet2"/>
+        <w:ind w:left="720"/>
+      </w:pPr>
+      <w:r>
+        <w:t>Facturacion</w:t>
+      </w:r>
+    </w:p>
+    <w:p>
+      <w:pPr>
+        <w:pStyle w:val="ListBullet2"/>
+        <w:ind w:left="720"/>
+      </w:pPr>
+      <w:r>
+        <w:t>Notas de credito</w:t>
+      </w:r>
+    </w:p>
+    <w:p>
+      <w:pPr>
+        <w:pStyle w:val="ListBullet2"/>
+        <w:ind w:left="720"/>
+      </w:pPr>
+      <w:r>
+        <w:t>Notas de debito</w:t>
+      </w:r>
+    </w:p>
+    <w:p>
+      <w:pPr>
+        <w:pStyle w:val="ListBullet2"/>
+        <w:ind w:left="720"/>
+      </w:pPr>
+      <w:r>
+        <w:t>Devoluciones de venta</w:t>
+      </w:r>
+    </w:p>
+    <w:p>
+      <w:pPr>
+        <w:pStyle w:val="ListBullet2"/>
+        <w:ind w:left="720"/>
+      </w:pPr>
+      <w:r>
+        <w:t>Listas de precios</w:t>
+      </w:r>
+    </w:p>
+    <w:p>
+      <w:pPr>
+        <w:pStyle w:val="ListBullet2"/>
+        <w:ind w:left="720"/>
+      </w:pPr>
+      <w:r>
+        <w:t>Descuentos</w:t>
+      </w:r>
+    </w:p>
+    <w:p>
+      <w:pPr>
+        <w:pStyle w:val="ListBullet2"/>
+        <w:ind w:left="720"/>
+      </w:pPr>
+      <w:r>
+        <w:t>Comisiones</w:t>
+      </w:r>
+    </w:p>
+    <w:p>
+      <w:pPr>
         <w:pStyle w:val="ListBullet"/>
       </w:pPr>
       <w:r>
@@ -4766,6 +4858,69 @@
     </w:p>
     <w:p>
       <w:pPr>
+        <w:pStyle w:val="ListBullet2"/>
+        <w:ind w:left="720"/>
+      </w:pPr>
+      <w:r>
+        <w:t>Solicitudes de compra</w:t>
+      </w:r>
+    </w:p>
+    <w:p>
+      <w:pPr>
+        <w:pStyle w:val="ListBullet2"/>
+        <w:ind w:left="720"/>
+      </w:pPr>
+      <w:r>
+        <w:t>Cotizaciones de proveedores</w:t>
+      </w:r>
+    </w:p>
+    <w:p>
+      <w:pPr>
+        <w:pStyle w:val="ListBullet2"/>
+        <w:ind w:left="720"/>
+      </w:pPr>
+      <w:r>
+        <w:t>Ordenes de compra</w:t>
+      </w:r>
+    </w:p>
+    <w:p>
+      <w:pPr>
+        <w:pStyle w:val="ListBullet2"/>
+        <w:ind w:left="720"/>
+      </w:pPr>
+      <w:r>
+        <w:t>Recepcion de compras</w:t>
+      </w:r>
+    </w:p>
+    <w:p>
+      <w:pPr>
+        <w:pStyle w:val="ListBullet2"/>
+        <w:ind w:left="720"/>
+      </w:pPr>
+      <w:r>
+        <w:t>Facturas de proveedores</w:t>
+      </w:r>
+    </w:p>
+    <w:p>
+      <w:pPr>
+        <w:pStyle w:val="ListBullet2"/>
+        <w:ind w:left="720"/>
+      </w:pPr>
+      <w:r>
+        <w:t>Devoluciones a proveedores</w:t>
+      </w:r>
+    </w:p>
+    <w:p>
+      <w:pPr>
+        <w:pStyle w:val="ListBullet2"/>
+        <w:ind w:left="720"/>
+      </w:pPr>
+      <w:r>
+        <w:t>Evaluacion de proveedores</w:t>
+      </w:r>
+    </w:p>
+    <w:p>
+      <w:pPr>
         <w:pStyle w:val="ListBullet"/>
       </w:pPr>
       <w:r>
@@ -4774,6 +4929,69 @@
     </w:p>
     <w:p>
       <w:pPr>
+        <w:pStyle w:val="ListBullet2"/>
+        <w:ind w:left="720"/>
+      </w:pPr>
+      <w:r>
+        <w:t>Productos</w:t>
+      </w:r>
+    </w:p>
+    <w:p>
+      <w:pPr>
+        <w:pStyle w:val="ListBullet2"/>
+        <w:ind w:left="720"/>
+      </w:pPr>
+      <w:r>
+        <w:t>Stock valorizado</w:t>
+      </w:r>
+    </w:p>
+    <w:p>
+      <w:pPr>
+        <w:pStyle w:val="ListBullet2"/>
+        <w:ind w:left="720"/>
+      </w:pPr>
+      <w:r>
+        <w:t>Transferencias</w:t>
+      </w:r>
+    </w:p>
+    <w:p>
+      <w:pPr>
+        <w:pStyle w:val="ListBullet2"/>
+        <w:ind w:left="720"/>
+      </w:pPr>
+      <w:r>
+        <w:t>Ajustes de inventario</w:t>
+      </w:r>
+    </w:p>
+    <w:p>
+      <w:pPr>
+        <w:pStyle w:val="ListBullet2"/>
+        <w:ind w:left="720"/>
+      </w:pPr>
+      <w:r>
+        <w:t>Kardex</w:t>
+      </w:r>
+    </w:p>
+    <w:p>
+      <w:pPr>
+        <w:pStyle w:val="ListBullet2"/>
+        <w:ind w:left="720"/>
+      </w:pPr>
+      <w:r>
+        <w:t>Lotes</w:t>
+      </w:r>
+    </w:p>
+    <w:p>
+      <w:pPr>
+        <w:pStyle w:val="ListBullet2"/>
+        <w:ind w:left="720"/>
+      </w:pPr>
+      <w:r>
+        <w:t>Series</w:t>
+      </w:r>
+    </w:p>
+    <w:p>
+      <w:pPr>
         <w:pStyle w:val="ListBullet"/>
       </w:pPr>
       <w:r>
@@ -4782,6 +5000,87 @@
     </w:p>
     <w:p>
       <w:pPr>
+        <w:pStyle w:val="ListBullet2"/>
+        <w:ind w:left="720"/>
+      </w:pPr>
+      <w:r>
+        <w:t>Caja</w:t>
+      </w:r>
+    </w:p>
+    <w:p>
+      <w:pPr>
+        <w:pStyle w:val="ListBullet2"/>
+        <w:ind w:left="720"/>
+      </w:pPr>
+      <w:r>
+        <w:t>Movimientos bancarios</w:t>
+      </w:r>
+    </w:p>
+    <w:p>
+      <w:pPr>
+        <w:pStyle w:val="ListBullet2"/>
+        <w:ind w:left="720"/>
+      </w:pPr>
+      <w:r>
+        <w:t>Ingresos</w:t>
+      </w:r>
+    </w:p>
+    <w:p>
+      <w:pPr>
+        <w:pStyle w:val="ListBullet2"/>
+        <w:ind w:left="720"/>
+      </w:pPr>
+      <w:r>
+        <w:t>Egresos</w:t>
+      </w:r>
+    </w:p>
+    <w:p>
+      <w:pPr>
+        <w:pStyle w:val="ListBullet2"/>
+        <w:ind w:left="720"/>
+      </w:pPr>
+      <w:r>
+        <w:t>Transferencias bancarias</w:t>
+      </w:r>
+    </w:p>
+    <w:p>
+      <w:pPr>
+        <w:pStyle w:val="ListBullet2"/>
+        <w:ind w:left="720"/>
+      </w:pPr>
+      <w:r>
+        <w:t>Pagos</w:t>
+      </w:r>
+    </w:p>
+    <w:p>
+      <w:pPr>
+        <w:pStyle w:val="ListBullet2"/>
+        <w:ind w:left="720"/>
+      </w:pPr>
+      <w:r>
+        <w:t>Cobranzas</w:t>
+      </w:r>
+    </w:p>
+    <w:p>
+      <w:pPr>
+        <w:pStyle w:val="ListBullet2"/>
+        <w:ind w:left="720"/>
+      </w:pPr>
+      <w:r>
+        <w:t>Conciliacion bancaria</w:t>
+      </w:r>
+    </w:p>
+    <w:p>
+      <w:pPr>
+        <w:pStyle w:val="ListBullet2"/>
+        <w:ind w:left="720"/>
+      </w:pPr>
+      <w:r>
+        <w:t>Flujo de caja</w:t>
+      </w:r>
+    </w:p>
+    <w:p>
+      <w:pPr>
         <w:pStyle w:val="ListBullet"/>
       </w:pPr>
       <w:r>
@@ -4790,6 +5089,69 @@
     </w:p>
     <w:p>
       <w:pPr>
+        <w:pStyle w:val="ListBullet2"/>
+        <w:ind w:left="720"/>
+      </w:pPr>
+      <w:r>
+        <w:t>Clientes</w:t>
+      </w:r>
+    </w:p>
+    <w:p>
+      <w:pPr>
+        <w:pStyle w:val="ListBullet2"/>
+        <w:ind w:left="720"/>
+      </w:pPr>
+      <w:r>
+        <w:t>Proveedores</w:t>
+      </w:r>
+    </w:p>
+    <w:p>
+      <w:pPr>
+        <w:pStyle w:val="ListBullet2"/>
+        <w:ind w:left="720"/>
+      </w:pPr>
+      <w:r>
+        <w:t>Contactos</w:t>
+      </w:r>
+    </w:p>
+    <w:p>
+      <w:pPr>
+        <w:pStyle w:val="ListBullet2"/>
+        <w:ind w:left="720"/>
+      </w:pPr>
+      <w:r>
+        <w:t>Direcciones</w:t>
+      </w:r>
+    </w:p>
+    <w:p>
+      <w:pPr>
+        <w:pStyle w:val="ListBullet2"/>
+        <w:ind w:left="720"/>
+      </w:pPr>
+      <w:r>
+        <w:t>Condiciones comerciales</w:t>
+      </w:r>
+    </w:p>
+    <w:p>
+      <w:pPr>
+        <w:pStyle w:val="ListBullet2"/>
+        <w:ind w:left="720"/>
+      </w:pPr>
+      <w:r>
+        <w:t>Limites de credito</w:t>
+      </w:r>
+    </w:p>
+    <w:p>
+      <w:pPr>
+        <w:pStyle w:val="ListBullet2"/>
+        <w:ind w:left="720"/>
+      </w:pPr>
+      <w:r>
+        <w:t>Historial comercial</w:t>
+      </w:r>
+    </w:p>
+    <w:p>
+      <w:pPr>
         <w:pStyle w:val="ListBullet"/>
       </w:pPr>
       <w:r>
@@ -4798,6 +5160,60 @@
     </w:p>
     <w:p>
       <w:pPr>
+        <w:pStyle w:val="ListBullet2"/>
+        <w:ind w:left="720"/>
+      </w:pPr>
+      <w:r>
+        <w:t>Presupuestos</w:t>
+      </w:r>
+    </w:p>
+    <w:p>
+      <w:pPr>
+        <w:pStyle w:val="ListBullet2"/>
+        <w:ind w:left="720"/>
+      </w:pPr>
+      <w:r>
+        <w:t>Centros de costo</w:t>
+      </w:r>
+    </w:p>
+    <w:p>
+      <w:pPr>
+        <w:pStyle w:val="ListBullet2"/>
+        <w:ind w:left="720"/>
+      </w:pPr>
+      <w:r>
+        <w:t>Costos operativos</w:t>
+      </w:r>
+    </w:p>
+    <w:p>
+      <w:pPr>
+        <w:pStyle w:val="ListBullet2"/>
+        <w:ind w:left="720"/>
+      </w:pPr>
+      <w:r>
+        <w:t>Costos por area</w:t>
+      </w:r>
+    </w:p>
+    <w:p>
+      <w:pPr>
+        <w:pStyle w:val="ListBullet2"/>
+        <w:ind w:left="720"/>
+      </w:pPr>
+      <w:r>
+        <w:t>Costos por proyecto</w:t>
+      </w:r>
+    </w:p>
+    <w:p>
+      <w:pPr>
+        <w:pStyle w:val="ListBullet2"/>
+        <w:ind w:left="720"/>
+      </w:pPr>
+      <w:r>
+        <w:t>Control presupuestario</w:t>
+      </w:r>
+    </w:p>
+    <w:p>
+      <w:pPr>
         <w:pStyle w:val="ListBullet"/>
       </w:pPr>
       <w:r>
@@ -4806,6 +5222,69 @@
     </w:p>
     <w:p>
       <w:pPr>
+        <w:pStyle w:val="ListBullet2"/>
+        <w:ind w:left="720"/>
+      </w:pPr>
+      <w:r>
+        <w:t>Dashboard ejecutivo</w:t>
+      </w:r>
+    </w:p>
+    <w:p>
+      <w:pPr>
+        <w:pStyle w:val="ListBullet2"/>
+        <w:ind w:left="720"/>
+      </w:pPr>
+      <w:r>
+        <w:t>Reportes de ventas</w:t>
+      </w:r>
+    </w:p>
+    <w:p>
+      <w:pPr>
+        <w:pStyle w:val="ListBullet2"/>
+        <w:ind w:left="720"/>
+      </w:pPr>
+      <w:r>
+        <w:t>Reportes de compras</w:t>
+      </w:r>
+    </w:p>
+    <w:p>
+      <w:pPr>
+        <w:pStyle w:val="ListBullet2"/>
+        <w:ind w:left="720"/>
+      </w:pPr>
+      <w:r>
+        <w:t>Reportes financieros</w:t>
+      </w:r>
+    </w:p>
+    <w:p>
+      <w:pPr>
+        <w:pStyle w:val="ListBullet2"/>
+        <w:ind w:left="720"/>
+      </w:pPr>
+      <w:r>
+        <w:t>Rentabilidad</w:t>
+      </w:r>
+    </w:p>
+    <w:p>
+      <w:pPr>
+        <w:pStyle w:val="ListBullet2"/>
+        <w:ind w:left="720"/>
+      </w:pPr>
+      <w:r>
+        <w:t>Flujo de caja</w:t>
+      </w:r>
+    </w:p>
+    <w:p>
+      <w:pPr>
+        <w:pStyle w:val="ListBullet2"/>
+        <w:ind w:left="720"/>
+      </w:pPr>
+      <w:r>
+        <w:t>KPIs</w:t>
+      </w:r>
+    </w:p>
+    <w:p>
+      <w:pPr>
         <w:pStyle w:val="ListBullet"/>
       </w:pPr>
       <w:r>
@@ -4814,6 +5293,186 @@
     </w:p>
     <w:p>
       <w:pPr>
+        <w:pStyle w:val="ListBullet2"/>
+        <w:ind w:left="720"/>
+      </w:pPr>
+      <w:r>
+        <w:t>Usuarios</w:t>
+      </w:r>
+    </w:p>
+    <w:p>
+      <w:pPr>
+        <w:pStyle w:val="ListBullet2"/>
+        <w:ind w:left="720"/>
+      </w:pPr>
+      <w:r>
+        <w:t>Roles</w:t>
+      </w:r>
+    </w:p>
+    <w:p>
+      <w:pPr>
+        <w:pStyle w:val="ListBullet2"/>
+        <w:ind w:left="720"/>
+      </w:pPr>
+      <w:r>
+        <w:t>Permisos</w:t>
+      </w:r>
+    </w:p>
+    <w:p>
+      <w:pPr>
+        <w:pStyle w:val="ListBullet2"/>
+        <w:ind w:left="720"/>
+      </w:pPr>
+      <w:r>
+        <w:t>Flujos de aprobacion</w:t>
+      </w:r>
+    </w:p>
+    <w:p>
+      <w:pPr>
+        <w:pStyle w:val="ListBullet2"/>
+        <w:ind w:left="720"/>
+      </w:pPr>
+      <w:r>
+        <w:t>Auditoria</w:t>
+      </w:r>
+    </w:p>
+    <w:p>
+      <w:pPr>
+        <w:pStyle w:val="ListBullet2"/>
+        <w:ind w:left="720"/>
+      </w:pPr>
+      <w:r>
+        <w:t>Bitacora de cambios</w:t>
+      </w:r>
+    </w:p>
+    <w:p>
+      <w:pPr>
+        <w:pStyle w:val="ListBullet2"/>
+        <w:ind w:left="720"/>
+      </w:pPr>
+      <w:r>
+        <w:t>Parametros generales</w:t>
+      </w:r>
+    </w:p>
+    <w:p>
+      <w:pPr>
+        <w:pStyle w:val="ListBullet2"/>
+        <w:ind w:left="720"/>
+      </w:pPr>
+      <w:r>
+        <w:t>Empresas y sucursales</w:t>
+      </w:r>
+    </w:p>
+    <w:p>
+      <w:pPr>
+        <w:pStyle w:val="ListBullet2"/>
+        <w:ind w:left="720"/>
+      </w:pPr>
+      <w:r>
+        <w:t>Series y correlativos</w:t>
+      </w:r>
+    </w:p>
+    <w:p>
+      <w:pPr>
+        <w:pStyle w:val="ListBullet2"/>
+        <w:ind w:left="720"/>
+      </w:pPr>
+      <w:r>
+        <w:t>Impuestos</w:t>
+      </w:r>
+    </w:p>
+    <w:p>
+      <w:pPr>
+        <w:pStyle w:val="ListBullet2"/>
+        <w:ind w:left="720"/>
+      </w:pPr>
+      <w:r>
+        <w:t>Monedas y tipo de cambio</w:t>
+      </w:r>
+    </w:p>
+    <w:p>
+      <w:pPr>
+        <w:pStyle w:val="ListBullet2"/>
+        <w:ind w:left="720"/>
+      </w:pPr>
+      <w:r>
+        <w:t>Plantillas y formatos</w:t>
+      </w:r>
+    </w:p>
+    <w:p>
+      <w:pPr>
+        <w:pStyle w:val="ListBullet2"/>
+        <w:ind w:left="720"/>
+      </w:pPr>
+      <w:r>
+        <w:t>Bancos y cuentas bancarias</w:t>
+      </w:r>
+    </w:p>
+    <w:p>
+      <w:pPr>
+        <w:pStyle w:val="ListBullet2"/>
+        <w:ind w:left="720"/>
+      </w:pPr>
+      <w:r>
+        <w:t>Categorias de productos</w:t>
+      </w:r>
+    </w:p>
+    <w:p>
+      <w:pPr>
+        <w:pStyle w:val="ListBullet2"/>
+        <w:ind w:left="720"/>
+      </w:pPr>
+      <w:r>
+        <w:t>Unidades de medida</w:t>
+      </w:r>
+    </w:p>
+    <w:p>
+      <w:pPr>
+        <w:pStyle w:val="ListBullet2"/>
+        <w:ind w:left="720"/>
+      </w:pPr>
+      <w:r>
+        <w:t>Estados de documentos</w:t>
+      </w:r>
+    </w:p>
+    <w:p>
+      <w:pPr>
+        <w:pStyle w:val="ListBullet2"/>
+        <w:ind w:left="720"/>
+      </w:pPr>
+      <w:r>
+        <w:t>Motivos de anulacion</w:t>
+      </w:r>
+    </w:p>
+    <w:p>
+      <w:pPr>
+        <w:pStyle w:val="ListBullet2"/>
+        <w:ind w:left="720"/>
+      </w:pPr>
+      <w:r>
+        <w:t>Motivos de devolucion</w:t>
+      </w:r>
+    </w:p>
+    <w:p>
+      <w:pPr>
+        <w:pStyle w:val="ListBullet2"/>
+        <w:ind w:left="720"/>
+      </w:pPr>
+      <w:r>
+        <w:t>Condiciones de pago</w:t>
+      </w:r>
+    </w:p>
+    <w:p>
+      <w:pPr>
+        <w:pStyle w:val="ListBullet2"/>
+        <w:ind w:left="720"/>
+      </w:pPr>
+      <w:r>
+        <w:t>Metodos de pago</w:t>
+      </w:r>
+    </w:p>
+    <w:p>
+      <w:pPr>
         <w:pStyle w:val="Heading2"/>
       </w:pPr>
       <w:r>
@@ -4830,6 +5489,51 @@
     </w:p>
     <w:p>
       <w:pPr>
+        <w:pStyle w:val="ListBullet2"/>
+        <w:ind w:left="720"/>
+      </w:pPr>
+      <w:r>
+        <w:t>Mapa de almacenes</w:t>
+      </w:r>
+    </w:p>
+    <w:p>
+      <w:pPr>
+        <w:pStyle w:val="ListBullet2"/>
+        <w:ind w:left="720"/>
+      </w:pPr>
+      <w:r>
+        <w:t>Mapa de ubicaciones</w:t>
+      </w:r>
+    </w:p>
+    <w:p>
+      <w:pPr>
+        <w:pStyle w:val="ListBullet2"/>
+        <w:ind w:left="720"/>
+      </w:pPr>
+      <w:r>
+        <w:t>Ocupacion por zona</w:t>
+      </w:r>
+    </w:p>
+    <w:p>
+      <w:pPr>
+        <w:pStyle w:val="ListBullet2"/>
+        <w:ind w:left="720"/>
+      </w:pPr>
+      <w:r>
+        <w:t>Capacidad por ubicacion</w:t>
+      </w:r>
+    </w:p>
+    <w:p>
+      <w:pPr>
+        <w:pStyle w:val="ListBullet2"/>
+        <w:ind w:left="720"/>
+      </w:pPr>
+      <w:r>
+        <w:t>Disponibilidad de ubicaciones</w:t>
+      </w:r>
+    </w:p>
+    <w:p>
+      <w:pPr>
         <w:pStyle w:val="ListBullet"/>
       </w:pPr>
       <w:r>
@@ -4838,6 +5542,69 @@
     </w:p>
     <w:p>
       <w:pPr>
+        <w:pStyle w:val="ListBullet2"/>
+        <w:ind w:left="720"/>
+      </w:pPr>
+      <w:r>
+        <w:t>SKU</w:t>
+      </w:r>
+    </w:p>
+    <w:p>
+      <w:pPr>
+        <w:pStyle w:val="ListBullet2"/>
+        <w:ind w:left="720"/>
+      </w:pPr>
+      <w:r>
+        <w:t>Productos</w:t>
+      </w:r>
+    </w:p>
+    <w:p>
+      <w:pPr>
+        <w:pStyle w:val="ListBullet2"/>
+        <w:ind w:left="720"/>
+      </w:pPr>
+      <w:r>
+        <w:t>Codigos de barras</w:t>
+      </w:r>
+    </w:p>
+    <w:p>
+      <w:pPr>
+        <w:pStyle w:val="ListBullet2"/>
+        <w:ind w:left="720"/>
+      </w:pPr>
+      <w:r>
+        <w:t>Lotes</w:t>
+      </w:r>
+    </w:p>
+    <w:p>
+      <w:pPr>
+        <w:pStyle w:val="ListBullet2"/>
+        <w:ind w:left="720"/>
+      </w:pPr>
+      <w:r>
+        <w:t>Series</w:t>
+      </w:r>
+    </w:p>
+    <w:p>
+      <w:pPr>
+        <w:pStyle w:val="ListBullet2"/>
+        <w:ind w:left="720"/>
+      </w:pPr>
+      <w:r>
+        <w:t>Dimensiones</w:t>
+      </w:r>
+    </w:p>
+    <w:p>
+      <w:pPr>
+        <w:pStyle w:val="ListBullet2"/>
+        <w:ind w:left="720"/>
+      </w:pPr>
+      <w:r>
+        <w:t>Peso</w:t>
+      </w:r>
+    </w:p>
+    <w:p>
+      <w:pPr>
         <w:pStyle w:val="ListBullet"/>
       </w:pPr>
       <w:r>
@@ -4846,6 +5613,78 @@
     </w:p>
     <w:p>
       <w:pPr>
+        <w:pStyle w:val="ListBullet2"/>
+        <w:ind w:left="720"/>
+      </w:pPr>
+      <w:r>
+        <w:t>Ordenes de recepcion</w:t>
+      </w:r>
+    </w:p>
+    <w:p>
+      <w:pPr>
+        <w:pStyle w:val="ListBullet2"/>
+        <w:ind w:left="720"/>
+      </w:pPr>
+      <w:r>
+        <w:t>ASN</w:t>
+      </w:r>
+    </w:p>
+    <w:p>
+      <w:pPr>
+        <w:pStyle w:val="ListBullet2"/>
+        <w:ind w:left="720"/>
+      </w:pPr>
+      <w:r>
+        <w:t>Recepcion de compras</w:t>
+      </w:r>
+    </w:p>
+    <w:p>
+      <w:pPr>
+        <w:pStyle w:val="ListBullet2"/>
+        <w:ind w:left="720"/>
+      </w:pPr>
+      <w:r>
+        <w:t>Recepcion de transferencias</w:t>
+      </w:r>
+    </w:p>
+    <w:p>
+      <w:pPr>
+        <w:pStyle w:val="ListBullet2"/>
+        <w:ind w:left="720"/>
+      </w:pPr>
+      <w:r>
+        <w:t>Recepcion de devoluciones</w:t>
+      </w:r>
+    </w:p>
+    <w:p>
+      <w:pPr>
+        <w:pStyle w:val="ListBullet2"/>
+        <w:ind w:left="720"/>
+      </w:pPr>
+      <w:r>
+        <w:t>Conteo</w:t>
+      </w:r>
+    </w:p>
+    <w:p>
+      <w:pPr>
+        <w:pStyle w:val="ListBullet2"/>
+        <w:ind w:left="720"/>
+      </w:pPr>
+      <w:r>
+        <w:t>Diferencias</w:t>
+      </w:r>
+    </w:p>
+    <w:p>
+      <w:pPr>
+        <w:pStyle w:val="ListBullet2"/>
+        <w:ind w:left="720"/>
+      </w:pPr>
+      <w:r>
+        <w:t>Inspeccion</w:t>
+      </w:r>
+    </w:p>
+    <w:p>
+      <w:pPr>
         <w:pStyle w:val="ListBullet"/>
       </w:pPr>
       <w:r>
@@ -4854,6 +5693,51 @@
     </w:p>
     <w:p>
       <w:pPr>
+        <w:pStyle w:val="ListBullet2"/>
+        <w:ind w:left="720"/>
+      </w:pPr>
+      <w:r>
+        <w:t>Asignacion de ubicacion</w:t>
+      </w:r>
+    </w:p>
+    <w:p>
+      <w:pPr>
+        <w:pStyle w:val="ListBullet2"/>
+        <w:ind w:left="720"/>
+      </w:pPr>
+      <w:r>
+        <w:t>Putaway automatico</w:t>
+      </w:r>
+    </w:p>
+    <w:p>
+      <w:pPr>
+        <w:pStyle w:val="ListBullet2"/>
+        <w:ind w:left="720"/>
+      </w:pPr>
+      <w:r>
+        <w:t>Putaway manual</w:t>
+      </w:r>
+    </w:p>
+    <w:p>
+      <w:pPr>
+        <w:pStyle w:val="ListBullet2"/>
+        <w:ind w:left="720"/>
+      </w:pPr>
+      <w:r>
+        <w:t>Reubicacion</w:t>
+      </w:r>
+    </w:p>
+    <w:p>
+      <w:pPr>
+        <w:pStyle w:val="ListBullet2"/>
+        <w:ind w:left="720"/>
+      </w:pPr>
+      <w:r>
+        <w:t>Consolidacion</w:t>
+      </w:r>
+    </w:p>
+    <w:p>
+      <w:pPr>
         <w:pStyle w:val="ListBullet"/>
       </w:pPr>
       <w:r>
@@ -4862,6 +5746,96 @@
     </w:p>
     <w:p>
       <w:pPr>
+        <w:pStyle w:val="ListBullet2"/>
+        <w:ind w:left="720"/>
+      </w:pPr>
+      <w:r>
+        <w:t>Stock por almacen</w:t>
+      </w:r>
+    </w:p>
+    <w:p>
+      <w:pPr>
+        <w:pStyle w:val="ListBullet2"/>
+        <w:ind w:left="720"/>
+      </w:pPr>
+      <w:r>
+        <w:t>Stock por ubicacion</w:t>
+      </w:r>
+    </w:p>
+    <w:p>
+      <w:pPr>
+        <w:pStyle w:val="ListBullet2"/>
+        <w:ind w:left="720"/>
+      </w:pPr>
+      <w:r>
+        <w:t>Stock disponible</w:t>
+      </w:r>
+    </w:p>
+    <w:p>
+      <w:pPr>
+        <w:pStyle w:val="ListBullet2"/>
+        <w:ind w:left="720"/>
+      </w:pPr>
+      <w:r>
+        <w:t>Stock reservado</w:t>
+      </w:r>
+    </w:p>
+    <w:p>
+      <w:pPr>
+        <w:pStyle w:val="ListBullet2"/>
+        <w:ind w:left="720"/>
+      </w:pPr>
+      <w:r>
+        <w:t>Stock bloqueado</w:t>
+      </w:r>
+    </w:p>
+    <w:p>
+      <w:pPr>
+        <w:pStyle w:val="ListBullet2"/>
+        <w:ind w:left="720"/>
+      </w:pPr>
+      <w:r>
+        <w:t>Stock en transito</w:t>
+      </w:r>
+    </w:p>
+    <w:p>
+      <w:pPr>
+        <w:pStyle w:val="ListBullet2"/>
+        <w:ind w:left="720"/>
+      </w:pPr>
+      <w:r>
+        <w:t>Kardex operativo</w:t>
+      </w:r>
+    </w:p>
+    <w:p>
+      <w:pPr>
+        <w:pStyle w:val="ListBullet2"/>
+        <w:ind w:left="720"/>
+      </w:pPr>
+      <w:r>
+        <w:t>Stock por lote</w:t>
+      </w:r>
+    </w:p>
+    <w:p>
+      <w:pPr>
+        <w:pStyle w:val="ListBullet2"/>
+        <w:ind w:left="720"/>
+      </w:pPr>
+      <w:r>
+        <w:t>Stock por serie</w:t>
+      </w:r>
+    </w:p>
+    <w:p>
+      <w:pPr>
+        <w:pStyle w:val="ListBullet2"/>
+        <w:ind w:left="720"/>
+      </w:pPr>
+      <w:r>
+        <w:t>Vencimientos</w:t>
+      </w:r>
+    </w:p>
+    <w:p>
+      <w:pPr>
         <w:pStyle w:val="ListBullet"/>
       </w:pPr>
       <w:r>
@@ -4870,6 +5844,69 @@
     </w:p>
     <w:p>
       <w:pPr>
+        <w:pStyle w:val="ListBullet2"/>
+        <w:ind w:left="720"/>
+      </w:pPr>
+      <w:r>
+        <w:t>Picking por pedido</w:t>
+      </w:r>
+    </w:p>
+    <w:p>
+      <w:pPr>
+        <w:pStyle w:val="ListBullet2"/>
+        <w:ind w:left="720"/>
+      </w:pPr>
+      <w:r>
+        <w:t>Picking por ola</w:t>
+      </w:r>
+    </w:p>
+    <w:p>
+      <w:pPr>
+        <w:pStyle w:val="ListBullet2"/>
+        <w:ind w:left="720"/>
+      </w:pPr>
+      <w:r>
+        <w:t>Picking por zona</w:t>
+      </w:r>
+    </w:p>
+    <w:p>
+      <w:pPr>
+        <w:pStyle w:val="ListBullet2"/>
+        <w:ind w:left="720"/>
+      </w:pPr>
+      <w:r>
+        <w:t>Picking por ruta</w:t>
+      </w:r>
+    </w:p>
+    <w:p>
+      <w:pPr>
+        <w:pStyle w:val="ListBullet2"/>
+        <w:ind w:left="720"/>
+      </w:pPr>
+      <w:r>
+        <w:t>Picking por lote</w:t>
+      </w:r>
+    </w:p>
+    <w:p>
+      <w:pPr>
+        <w:pStyle w:val="ListBullet2"/>
+        <w:ind w:left="720"/>
+      </w:pPr>
+      <w:r>
+        <w:t>Picking parcial</w:t>
+      </w:r>
+    </w:p>
+    <w:p>
+      <w:pPr>
+        <w:pStyle w:val="ListBullet2"/>
+        <w:ind w:left="720"/>
+      </w:pPr>
+      <w:r>
+        <w:t>Reposicion</w:t>
+      </w:r>
+    </w:p>
+    <w:p>
+      <w:pPr>
         <w:pStyle w:val="ListBullet"/>
       </w:pPr>
       <w:r>
@@ -4878,6 +5915,69 @@
     </w:p>
     <w:p>
       <w:pPr>
+        <w:pStyle w:val="ListBullet2"/>
+        <w:ind w:left="720"/>
+      </w:pPr>
+      <w:r>
+        <w:t>Empaque</w:t>
+      </w:r>
+    </w:p>
+    <w:p>
+      <w:pPr>
+        <w:pStyle w:val="ListBullet2"/>
+        <w:ind w:left="720"/>
+      </w:pPr>
+      <w:r>
+        <w:t>Cajas</w:t>
+      </w:r>
+    </w:p>
+    <w:p>
+      <w:pPr>
+        <w:pStyle w:val="ListBullet2"/>
+        <w:ind w:left="720"/>
+      </w:pPr>
+      <w:r>
+        <w:t>Bultos</w:t>
+      </w:r>
+    </w:p>
+    <w:p>
+      <w:pPr>
+        <w:pStyle w:val="ListBullet2"/>
+        <w:ind w:left="720"/>
+      </w:pPr>
+      <w:r>
+        <w:t>Etiquetas</w:t>
+      </w:r>
+    </w:p>
+    <w:p>
+      <w:pPr>
+        <w:pStyle w:val="ListBullet2"/>
+        <w:ind w:left="720"/>
+      </w:pPr>
+      <w:r>
+        <w:t>Pesaje</w:t>
+      </w:r>
+    </w:p>
+    <w:p>
+      <w:pPr>
+        <w:pStyle w:val="ListBullet2"/>
+        <w:ind w:left="720"/>
+      </w:pPr>
+      <w:r>
+        <w:t>Dimensiones</w:t>
+      </w:r>
+    </w:p>
+    <w:p>
+      <w:pPr>
+        <w:pStyle w:val="ListBullet2"/>
+        <w:ind w:left="720"/>
+      </w:pPr>
+      <w:r>
+        <w:t>Consolidacion</w:t>
+      </w:r>
+    </w:p>
+    <w:p>
+      <w:pPr>
         <w:pStyle w:val="ListBullet"/>
       </w:pPr>
       <w:r>
@@ -4886,6 +5986,51 @@
     </w:p>
     <w:p>
       <w:pPr>
+        <w:pStyle w:val="ListBullet2"/>
+        <w:ind w:left="720"/>
+      </w:pPr>
+      <w:r>
+        <w:t>Pedidos preparados</w:t>
+      </w:r>
+    </w:p>
+    <w:p>
+      <w:pPr>
+        <w:pStyle w:val="ListBullet2"/>
+        <w:ind w:left="720"/>
+      </w:pPr>
+      <w:r>
+        <w:t>Verificacion</w:t>
+      </w:r>
+    </w:p>
+    <w:p>
+      <w:pPr>
+        <w:pStyle w:val="ListBullet2"/>
+        <w:ind w:left="720"/>
+      </w:pPr>
+      <w:r>
+        <w:t>Consolidacion de carga</w:t>
+      </w:r>
+    </w:p>
+    <w:p>
+      <w:pPr>
+        <w:pStyle w:val="ListBullet2"/>
+        <w:ind w:left="720"/>
+      </w:pPr>
+      <w:r>
+        <w:t>Control de salida</w:t>
+      </w:r>
+    </w:p>
+    <w:p>
+      <w:pPr>
+        <w:pStyle w:val="ListBullet2"/>
+        <w:ind w:left="720"/>
+      </w:pPr>
+      <w:r>
+        <w:t>Entrega al transportista</w:t>
+      </w:r>
+    </w:p>
+    <w:p>
+      <w:pPr>
         <w:pStyle w:val="ListBullet"/>
       </w:pPr>
       <w:r>
@@ -4894,6 +6039,51 @@
     </w:p>
     <w:p>
       <w:pPr>
+        <w:pStyle w:val="ListBullet2"/>
+        <w:ind w:left="720"/>
+      </w:pPr>
+      <w:r>
+        <w:t>Transferencias</w:t>
+      </w:r>
+    </w:p>
+    <w:p>
+      <w:pPr>
+        <w:pStyle w:val="ListBullet2"/>
+        <w:ind w:left="720"/>
+      </w:pPr>
+      <w:r>
+        <w:t>Reubicaciones</w:t>
+      </w:r>
+    </w:p>
+    <w:p>
+      <w:pPr>
+        <w:pStyle w:val="ListBullet2"/>
+        <w:ind w:left="720"/>
+      </w:pPr>
+      <w:r>
+        <w:t>Ajustes</w:t>
+      </w:r>
+    </w:p>
+    <w:p>
+      <w:pPr>
+        <w:pStyle w:val="ListBullet2"/>
+        <w:ind w:left="720"/>
+      </w:pPr>
+      <w:r>
+        <w:t>Consumos</w:t>
+      </w:r>
+    </w:p>
+    <w:p>
+      <w:pPr>
+        <w:pStyle w:val="ListBullet2"/>
+        <w:ind w:left="720"/>
+      </w:pPr>
+      <w:r>
+        <w:t>Devoluciones</w:t>
+      </w:r>
+    </w:p>
+    <w:p>
+      <w:pPr>
         <w:pStyle w:val="ListBullet"/>
       </w:pPr>
       <w:r>
@@ -4902,6 +6092,51 @@
     </w:p>
     <w:p>
       <w:pPr>
+        <w:pStyle w:val="ListBullet2"/>
+        <w:ind w:left="720"/>
+      </w:pPr>
+      <w:r>
+        <w:t>Inventario general</w:t>
+      </w:r>
+    </w:p>
+    <w:p>
+      <w:pPr>
+        <w:pStyle w:val="ListBullet2"/>
+        <w:ind w:left="720"/>
+      </w:pPr>
+      <w:r>
+        <w:t>Conteo ciclico</w:t>
+      </w:r>
+    </w:p>
+    <w:p>
+      <w:pPr>
+        <w:pStyle w:val="ListBullet2"/>
+        <w:ind w:left="720"/>
+      </w:pPr>
+      <w:r>
+        <w:t>Conteo por ubicacion</w:t>
+      </w:r>
+    </w:p>
+    <w:p>
+      <w:pPr>
+        <w:pStyle w:val="ListBullet2"/>
+        <w:ind w:left="720"/>
+      </w:pPr>
+      <w:r>
+        <w:t>Reconteo</w:t>
+      </w:r>
+    </w:p>
+    <w:p>
+      <w:pPr>
+        <w:pStyle w:val="ListBullet2"/>
+        <w:ind w:left="720"/>
+      </w:pPr>
+      <w:r>
+        <w:t>Ajustes por diferencias</w:t>
+      </w:r>
+    </w:p>
+    <w:p>
+      <w:pPr>
         <w:pStyle w:val="ListBullet"/>
       </w:pPr>
       <w:r>
@@ -4910,6 +6145,60 @@
     </w:p>
     <w:p>
       <w:pPr>
+        <w:pStyle w:val="ListBullet2"/>
+        <w:ind w:left="720"/>
+      </w:pPr>
+      <w:r>
+        <w:t>Inspecciones</w:t>
+      </w:r>
+    </w:p>
+    <w:p>
+      <w:pPr>
+        <w:pStyle w:val="ListBullet2"/>
+        <w:ind w:left="720"/>
+      </w:pPr>
+      <w:r>
+        <w:t>Cuarentena</w:t>
+      </w:r>
+    </w:p>
+    <w:p>
+      <w:pPr>
+        <w:pStyle w:val="ListBullet2"/>
+        <w:ind w:left="720"/>
+      </w:pPr>
+      <w:r>
+        <w:t>Productos danados</w:t>
+      </w:r>
+    </w:p>
+    <w:p>
+      <w:pPr>
+        <w:pStyle w:val="ListBullet2"/>
+        <w:ind w:left="720"/>
+      </w:pPr>
+      <w:r>
+        <w:t>Productos rechazados</w:t>
+      </w:r>
+    </w:p>
+    <w:p>
+      <w:pPr>
+        <w:pStyle w:val="ListBullet2"/>
+        <w:ind w:left="720"/>
+      </w:pPr>
+      <w:r>
+        <w:t>Liberacion</w:t>
+      </w:r>
+    </w:p>
+    <w:p>
+      <w:pPr>
+        <w:pStyle w:val="ListBullet2"/>
+        <w:ind w:left="720"/>
+      </w:pPr>
+      <w:r>
+        <w:t>No conformidades</w:t>
+      </w:r>
+    </w:p>
+    <w:p>
+      <w:pPr>
         <w:pStyle w:val="ListBullet"/>
       </w:pPr>
       <w:r>
@@ -4918,6 +6207,60 @@
     </w:p>
     <w:p>
       <w:pPr>
+        <w:pStyle w:val="ListBullet2"/>
+        <w:ind w:left="720"/>
+      </w:pPr>
+      <w:r>
+        <w:t>Handheld</w:t>
+      </w:r>
+    </w:p>
+    <w:p>
+      <w:pPr>
+        <w:pStyle w:val="ListBullet2"/>
+        <w:ind w:left="720"/>
+      </w:pPr>
+      <w:r>
+        <w:t>RF</w:t>
+      </w:r>
+    </w:p>
+    <w:p>
+      <w:pPr>
+        <w:pStyle w:val="ListBullet2"/>
+        <w:ind w:left="720"/>
+      </w:pPr>
+      <w:r>
+        <w:t>Codigo de barras</w:t>
+      </w:r>
+    </w:p>
+    <w:p>
+      <w:pPr>
+        <w:pStyle w:val="ListBullet2"/>
+        <w:ind w:left="720"/>
+      </w:pPr>
+      <w:r>
+        <w:t>RFID</w:t>
+      </w:r>
+    </w:p>
+    <w:p>
+      <w:pPr>
+        <w:pStyle w:val="ListBullet2"/>
+        <w:ind w:left="720"/>
+      </w:pPr>
+      <w:r>
+        <w:t>Impresoras</w:t>
+      </w:r>
+    </w:p>
+    <w:p>
+      <w:pPr>
+        <w:pStyle w:val="ListBullet2"/>
+        <w:ind w:left="720"/>
+      </w:pPr>
+      <w:r>
+        <w:t>Balanzas</w:t>
+      </w:r>
+    </w:p>
+    <w:p>
+      <w:pPr>
         <w:pStyle w:val="ListBullet"/>
       </w:pPr>
       <w:r>
@@ -4926,6 +6269,69 @@
     </w:p>
     <w:p>
       <w:pPr>
+        <w:pStyle w:val="ListBullet2"/>
+        <w:ind w:left="720"/>
+      </w:pPr>
+      <w:r>
+        <w:t>Exactitud de inventario</w:t>
+      </w:r>
+    </w:p>
+    <w:p>
+      <w:pPr>
+        <w:pStyle w:val="ListBullet2"/>
+        <w:ind w:left="720"/>
+      </w:pPr>
+      <w:r>
+        <w:t>Productividad de picking</w:t>
+      </w:r>
+    </w:p>
+    <w:p>
+      <w:pPr>
+        <w:pStyle w:val="ListBullet2"/>
+        <w:ind w:left="720"/>
+      </w:pPr>
+      <w:r>
+        <w:t>Tiempo de recepcion</w:t>
+      </w:r>
+    </w:p>
+    <w:p>
+      <w:pPr>
+        <w:pStyle w:val="ListBullet2"/>
+        <w:ind w:left="720"/>
+      </w:pPr>
+      <w:r>
+        <w:t>Tiempo de despacho</w:t>
+      </w:r>
+    </w:p>
+    <w:p>
+      <w:pPr>
+        <w:pStyle w:val="ListBullet2"/>
+        <w:ind w:left="720"/>
+      </w:pPr>
+      <w:r>
+        <w:t>Ocupacion</w:t>
+      </w:r>
+    </w:p>
+    <w:p>
+      <w:pPr>
+        <w:pStyle w:val="ListBullet2"/>
+        <w:ind w:left="720"/>
+      </w:pPr>
+      <w:r>
+        <w:t>Errores de picking</w:t>
+      </w:r>
+    </w:p>
+    <w:p>
+      <w:pPr>
+        <w:pStyle w:val="ListBullet2"/>
+        <w:ind w:left="720"/>
+      </w:pPr>
+      <w:r>
+        <w:t>Merma</w:t>
+      </w:r>
+    </w:p>
+    <w:p>
+      <w:pPr>
         <w:pStyle w:val="ListBullet"/>
       </w:pPr>
       <w:r>
@@ -4934,6 +6340,195 @@
     </w:p>
     <w:p>
       <w:pPr>
+        <w:pStyle w:val="ListBullet2"/>
+        <w:ind w:left="720"/>
+      </w:pPr>
+      <w:r>
+        <w:t>Usuarios</w:t>
+      </w:r>
+    </w:p>
+    <w:p>
+      <w:pPr>
+        <w:pStyle w:val="ListBullet2"/>
+        <w:ind w:left="720"/>
+      </w:pPr>
+      <w:r>
+        <w:t>Roles</w:t>
+      </w:r>
+    </w:p>
+    <w:p>
+      <w:pPr>
+        <w:pStyle w:val="ListBullet2"/>
+        <w:ind w:left="720"/>
+      </w:pPr>
+      <w:r>
+        <w:t>Permisos</w:t>
+      </w:r>
+    </w:p>
+    <w:p>
+      <w:pPr>
+        <w:pStyle w:val="ListBullet2"/>
+        <w:ind w:left="720"/>
+      </w:pPr>
+      <w:r>
+        <w:t>Flujos de aprobacion</w:t>
+      </w:r>
+    </w:p>
+    <w:p>
+      <w:pPr>
+        <w:pStyle w:val="ListBullet2"/>
+        <w:ind w:left="720"/>
+      </w:pPr>
+      <w:r>
+        <w:t>Auditoria</w:t>
+      </w:r>
+    </w:p>
+    <w:p>
+      <w:pPr>
+        <w:pStyle w:val="ListBullet2"/>
+        <w:ind w:left="720"/>
+      </w:pPr>
+      <w:r>
+        <w:t>Bitacora de cambios</w:t>
+      </w:r>
+    </w:p>
+    <w:p>
+      <w:pPr>
+        <w:pStyle w:val="ListBullet2"/>
+        <w:ind w:left="720"/>
+      </w:pPr>
+      <w:r>
+        <w:t>Parametros operativos de almacen</w:t>
+      </w:r>
+    </w:p>
+    <w:p>
+      <w:pPr>
+        <w:pStyle w:val="ListBullet2"/>
+        <w:ind w:left="720"/>
+      </w:pPr>
+      <w:r>
+        <w:t>Almacenes</w:t>
+      </w:r>
+    </w:p>
+    <w:p>
+      <w:pPr>
+        <w:pStyle w:val="ListBullet2"/>
+        <w:ind w:left="720"/>
+      </w:pPr>
+      <w:r>
+        <w:t>Areas</w:t>
+      </w:r>
+    </w:p>
+    <w:p>
+      <w:pPr>
+        <w:pStyle w:val="ListBullet2"/>
+        <w:ind w:left="720"/>
+      </w:pPr>
+      <w:r>
+        <w:t>Zonas</w:t>
+      </w:r>
+    </w:p>
+    <w:p>
+      <w:pPr>
+        <w:pStyle w:val="ListBullet2"/>
+        <w:ind w:left="720"/>
+      </w:pPr>
+      <w:r>
+        <w:t>Pasillos</w:t>
+      </w:r>
+    </w:p>
+    <w:p>
+      <w:pPr>
+        <w:pStyle w:val="ListBullet2"/>
+        <w:ind w:left="720"/>
+      </w:pPr>
+      <w:r>
+        <w:t>Racks</w:t>
+      </w:r>
+    </w:p>
+    <w:p>
+      <w:pPr>
+        <w:pStyle w:val="ListBullet2"/>
+        <w:ind w:left="720"/>
+      </w:pPr>
+      <w:r>
+        <w:t>Niveles</w:t>
+      </w:r>
+    </w:p>
+    <w:p>
+      <w:pPr>
+        <w:pStyle w:val="ListBullet2"/>
+        <w:ind w:left="720"/>
+      </w:pPr>
+      <w:r>
+        <w:t>Ubicaciones</w:t>
+      </w:r>
+    </w:p>
+    <w:p>
+      <w:pPr>
+        <w:pStyle w:val="ListBullet2"/>
+        <w:ind w:left="720"/>
+      </w:pPr>
+      <w:r>
+        <w:t>Muelles</w:t>
+      </w:r>
+    </w:p>
+    <w:p>
+      <w:pPr>
+        <w:pStyle w:val="ListBullet2"/>
+        <w:ind w:left="720"/>
+      </w:pPr>
+      <w:r>
+        <w:t>Categorias logisticas</w:t>
+      </w:r>
+    </w:p>
+    <w:p>
+      <w:pPr>
+        <w:pStyle w:val="ListBullet2"/>
+        <w:ind w:left="720"/>
+      </w:pPr>
+      <w:r>
+        <w:t>Unidades logisticas</w:t>
+      </w:r>
+    </w:p>
+    <w:p>
+      <w:pPr>
+        <w:pStyle w:val="ListBullet2"/>
+        <w:ind w:left="720"/>
+      </w:pPr>
+      <w:r>
+        <w:t>Reglas de ubicacion</w:t>
+      </w:r>
+    </w:p>
+    <w:p>
+      <w:pPr>
+        <w:pStyle w:val="ListBullet2"/>
+        <w:ind w:left="720"/>
+      </w:pPr>
+      <w:r>
+        <w:t>Motivos de ajuste</w:t>
+      </w:r>
+    </w:p>
+    <w:p>
+      <w:pPr>
+        <w:pStyle w:val="ListBullet2"/>
+        <w:ind w:left="720"/>
+      </w:pPr>
+      <w:r>
+        <w:t>Estados de recepcion</w:t>
+      </w:r>
+    </w:p>
+    <w:p>
+      <w:pPr>
+        <w:pStyle w:val="ListBullet2"/>
+        <w:ind w:left="720"/>
+      </w:pPr>
+      <w:r>
+        <w:t>Estados de despacho</w:t>
+      </w:r>
+    </w:p>
+    <w:p>
+      <w:pPr>
         <w:pStyle w:val="Heading2"/>
       </w:pPr>
       <w:r>
@@ -4950,6 +6545,60 @@
     </w:p>
     <w:p>
       <w:pPr>
+        <w:pStyle w:val="ListBullet2"/>
+        <w:ind w:left="720"/>
+      </w:pPr>
+      <w:r>
+        <w:t>Solicitudes de transporte</w:t>
+      </w:r>
+    </w:p>
+    <w:p>
+      <w:pPr>
+        <w:pStyle w:val="ListBullet2"/>
+        <w:ind w:left="720"/>
+      </w:pPr>
+      <w:r>
+        <w:t>Ordenes de transporte</w:t>
+      </w:r>
+    </w:p>
+    <w:p>
+      <w:pPr>
+        <w:pStyle w:val="ListBullet2"/>
+        <w:ind w:left="720"/>
+      </w:pPr>
+      <w:r>
+        <w:t>Pedidos a transportar</w:t>
+      </w:r>
+    </w:p>
+    <w:p>
+      <w:pPr>
+        <w:pStyle w:val="ListBullet2"/>
+        <w:ind w:left="720"/>
+      </w:pPr>
+      <w:r>
+        <w:t>Consolidacion</w:t>
+      </w:r>
+    </w:p>
+    <w:p>
+      <w:pPr>
+        <w:pStyle w:val="ListBullet2"/>
+        <w:ind w:left="720"/>
+      </w:pPr>
+      <w:r>
+        <w:t>Prioridades</w:t>
+      </w:r>
+    </w:p>
+    <w:p>
+      <w:pPr>
+        <w:pStyle w:val="ListBullet2"/>
+        <w:ind w:left="720"/>
+      </w:pPr>
+      <w:r>
+        <w:t>Ventanas horarias</w:t>
+      </w:r>
+    </w:p>
+    <w:p>
+      <w:pPr>
         <w:pStyle w:val="ListBullet"/>
       </w:pPr>
       <w:r>
@@ -4958,6 +6607,60 @@
     </w:p>
     <w:p>
       <w:pPr>
+        <w:pStyle w:val="ListBullet2"/>
+        <w:ind w:left="720"/>
+      </w:pPr>
+      <w:r>
+        <w:t>Planificacion de viajes</w:t>
+      </w:r>
+    </w:p>
+    <w:p>
+      <w:pPr>
+        <w:pStyle w:val="ListBullet2"/>
+        <w:ind w:left="720"/>
+      </w:pPr>
+      <w:r>
+        <w:t>Asignacion de vehiculos</w:t>
+      </w:r>
+    </w:p>
+    <w:p>
+      <w:pPr>
+        <w:pStyle w:val="ListBullet2"/>
+        <w:ind w:left="720"/>
+      </w:pPr>
+      <w:r>
+        <w:t>Asignacion de conductores</w:t>
+      </w:r>
+    </w:p>
+    <w:p>
+      <w:pPr>
+        <w:pStyle w:val="ListBullet2"/>
+        <w:ind w:left="720"/>
+      </w:pPr>
+      <w:r>
+        <w:t>Consolidacion de cargas</w:t>
+      </w:r>
+    </w:p>
+    <w:p>
+      <w:pPr>
+        <w:pStyle w:val="ListBullet2"/>
+        <w:ind w:left="720"/>
+      </w:pPr>
+      <w:r>
+        <w:t>Capacidad</w:t>
+      </w:r>
+    </w:p>
+    <w:p>
+      <w:pPr>
+        <w:pStyle w:val="ListBullet2"/>
+        <w:ind w:left="720"/>
+      </w:pPr>
+      <w:r>
+        <w:t>Secuencia de entregas</w:t>
+      </w:r>
+    </w:p>
+    <w:p>
+      <w:pPr>
         <w:pStyle w:val="ListBullet"/>
       </w:pPr>
       <w:r>
@@ -4966,6 +6669,51 @@
     </w:p>
     <w:p>
       <w:pPr>
+        <w:pStyle w:val="ListBullet2"/>
+        <w:ind w:left="720"/>
+      </w:pPr>
+      <w:r>
+        <w:t>Creacion de rutas</w:t>
+      </w:r>
+    </w:p>
+    <w:p>
+      <w:pPr>
+        <w:pStyle w:val="ListBullet2"/>
+        <w:ind w:left="720"/>
+      </w:pPr>
+      <w:r>
+        <w:t>Optimizacion de rutas</w:t>
+      </w:r>
+    </w:p>
+    <w:p>
+      <w:pPr>
+        <w:pStyle w:val="ListBullet2"/>
+        <w:ind w:left="720"/>
+      </w:pPr>
+      <w:r>
+        <w:t>Paradas</w:t>
+      </w:r>
+    </w:p>
+    <w:p>
+      <w:pPr>
+        <w:pStyle w:val="ListBullet2"/>
+        <w:ind w:left="720"/>
+      </w:pPr>
+      <w:r>
+        <w:t>Distancias</w:t>
+      </w:r>
+    </w:p>
+    <w:p>
+      <w:pPr>
+        <w:pStyle w:val="ListBullet2"/>
+        <w:ind w:left="720"/>
+      </w:pPr>
+      <w:r>
+        <w:t>Ventanas horarias</w:t>
+      </w:r>
+    </w:p>
+    <w:p>
+      <w:pPr>
         <w:pStyle w:val="ListBullet"/>
       </w:pPr>
       <w:r>
@@ -4974,6 +6722,60 @@
     </w:p>
     <w:p>
       <w:pPr>
+        <w:pStyle w:val="ListBullet2"/>
+        <w:ind w:left="720"/>
+      </w:pPr>
+      <w:r>
+        <w:t>Vehiculos</w:t>
+      </w:r>
+    </w:p>
+    <w:p>
+      <w:pPr>
+        <w:pStyle w:val="ListBullet2"/>
+        <w:ind w:left="720"/>
+      </w:pPr>
+      <w:r>
+        <w:t>Capacidad</w:t>
+      </w:r>
+    </w:p>
+    <w:p>
+      <w:pPr>
+        <w:pStyle w:val="ListBullet2"/>
+        <w:ind w:left="720"/>
+      </w:pPr>
+      <w:r>
+        <w:t>Kilometraje</w:t>
+      </w:r>
+    </w:p>
+    <w:p>
+      <w:pPr>
+        <w:pStyle w:val="ListBullet2"/>
+        <w:ind w:left="720"/>
+      </w:pPr>
+      <w:r>
+        <w:t>Combustible</w:t>
+      </w:r>
+    </w:p>
+    <w:p>
+      <w:pPr>
+        <w:pStyle w:val="ListBullet2"/>
+        <w:ind w:left="720"/>
+      </w:pPr>
+      <w:r>
+        <w:t>Documentacion</w:t>
+      </w:r>
+    </w:p>
+    <w:p>
+      <w:pPr>
+        <w:pStyle w:val="ListBullet2"/>
+        <w:ind w:left="720"/>
+      </w:pPr>
+      <w:r>
+        <w:t>Disponibilidad</w:t>
+      </w:r>
+    </w:p>
+    <w:p>
+      <w:pPr>
         <w:pStyle w:val="ListBullet"/>
       </w:pPr>
       <w:r>
@@ -4982,6 +6784,60 @@
     </w:p>
     <w:p>
       <w:pPr>
+        <w:pStyle w:val="ListBullet2"/>
+        <w:ind w:left="720"/>
+      </w:pPr>
+      <w:r>
+        <w:t>Conductores</w:t>
+      </w:r>
+    </w:p>
+    <w:p>
+      <w:pPr>
+        <w:pStyle w:val="ListBullet2"/>
+        <w:ind w:left="720"/>
+      </w:pPr>
+      <w:r>
+        <w:t>Licencias</w:t>
+      </w:r>
+    </w:p>
+    <w:p>
+      <w:pPr>
+        <w:pStyle w:val="ListBullet2"/>
+        <w:ind w:left="720"/>
+      </w:pPr>
+      <w:r>
+        <w:t>Documentos</w:t>
+      </w:r>
+    </w:p>
+    <w:p>
+      <w:pPr>
+        <w:pStyle w:val="ListBullet2"/>
+        <w:ind w:left="720"/>
+      </w:pPr>
+      <w:r>
+        <w:t>Asignaciones</w:t>
+      </w:r>
+    </w:p>
+    <w:p>
+      <w:pPr>
+        <w:pStyle w:val="ListBullet2"/>
+        <w:ind w:left="720"/>
+      </w:pPr>
+      <w:r>
+        <w:t>Historial de viajes</w:t>
+      </w:r>
+    </w:p>
+    <w:p>
+      <w:pPr>
+        <w:pStyle w:val="ListBullet2"/>
+        <w:ind w:left="720"/>
+      </w:pPr>
+      <w:r>
+        <w:t>Historial de incidencias del conductor</w:t>
+      </w:r>
+    </w:p>
+    <w:p>
+      <w:pPr>
         <w:pStyle w:val="ListBullet"/>
       </w:pPr>
       <w:r>
@@ -4990,6 +6846,69 @@
     </w:p>
     <w:p>
       <w:pPr>
+        <w:pStyle w:val="ListBullet2"/>
+        <w:ind w:left="720"/>
+      </w:pPr>
+      <w:r>
+        <w:t>GPS</w:t>
+      </w:r>
+    </w:p>
+    <w:p>
+      <w:pPr>
+        <w:pStyle w:val="ListBullet2"/>
+        <w:ind w:left="720"/>
+      </w:pPr>
+      <w:r>
+        <w:t>Ubicacion</w:t>
+      </w:r>
+    </w:p>
+    <w:p>
+      <w:pPr>
+        <w:pStyle w:val="ListBullet2"/>
+        <w:ind w:left="720"/>
+      </w:pPr>
+      <w:r>
+        <w:t>Seguimiento en tiempo real</w:t>
+      </w:r>
+    </w:p>
+    <w:p>
+      <w:pPr>
+        <w:pStyle w:val="ListBullet2"/>
+        <w:ind w:left="720"/>
+      </w:pPr>
+      <w:r>
+        <w:t>ETA</w:t>
+      </w:r>
+    </w:p>
+    <w:p>
+      <w:pPr>
+        <w:pStyle w:val="ListBullet2"/>
+        <w:ind w:left="720"/>
+      </w:pPr>
+      <w:r>
+        <w:t>Geocercas</w:t>
+      </w:r>
+    </w:p>
+    <w:p>
+      <w:pPr>
+        <w:pStyle w:val="ListBullet2"/>
+        <w:ind w:left="720"/>
+      </w:pPr>
+      <w:r>
+        <w:t>Paradas</w:t>
+      </w:r>
+    </w:p>
+    <w:p>
+      <w:pPr>
+        <w:pStyle w:val="ListBullet2"/>
+        <w:ind w:left="720"/>
+      </w:pPr>
+      <w:r>
+        <w:t>Historial de recorrido</w:t>
+      </w:r>
+    </w:p>
+    <w:p>
+      <w:pPr>
         <w:pStyle w:val="ListBullet"/>
       </w:pPr>
       <w:r>
@@ -4998,6 +6917,78 @@
     </w:p>
     <w:p>
       <w:pPr>
+        <w:pStyle w:val="ListBullet2"/>
+        <w:ind w:left="720"/>
+      </w:pPr>
+      <w:r>
+        <w:t>Entregas</w:t>
+      </w:r>
+    </w:p>
+    <w:p>
+      <w:pPr>
+        <w:pStyle w:val="ListBullet2"/>
+        <w:ind w:left="720"/>
+      </w:pPr>
+      <w:r>
+        <w:t>Confirmacion de entrega</w:t>
+      </w:r>
+    </w:p>
+    <w:p>
+      <w:pPr>
+        <w:pStyle w:val="ListBullet2"/>
+        <w:ind w:left="720"/>
+      </w:pPr>
+      <w:r>
+        <w:t>Firma digital</w:t>
+      </w:r>
+    </w:p>
+    <w:p>
+      <w:pPr>
+        <w:pStyle w:val="ListBullet2"/>
+        <w:ind w:left="720"/>
+      </w:pPr>
+      <w:r>
+        <w:t>Foto</w:t>
+      </w:r>
+    </w:p>
+    <w:p>
+      <w:pPr>
+        <w:pStyle w:val="ListBullet2"/>
+        <w:ind w:left="720"/>
+      </w:pPr>
+      <w:r>
+        <w:t>Fecha y hora</w:t>
+      </w:r>
+    </w:p>
+    <w:p>
+      <w:pPr>
+        <w:pStyle w:val="ListBullet2"/>
+        <w:ind w:left="720"/>
+      </w:pPr>
+      <w:r>
+        <w:t>Receptor</w:t>
+      </w:r>
+    </w:p>
+    <w:p>
+      <w:pPr>
+        <w:pStyle w:val="ListBullet2"/>
+        <w:ind w:left="720"/>
+      </w:pPr>
+      <w:r>
+        <w:t>Entrega parcial</w:t>
+      </w:r>
+    </w:p>
+    <w:p>
+      <w:pPr>
+        <w:pStyle w:val="ListBullet2"/>
+        <w:ind w:left="720"/>
+      </w:pPr>
+      <w:r>
+        <w:t>Rechazos</w:t>
+      </w:r>
+    </w:p>
+    <w:p>
+      <w:pPr>
         <w:pStyle w:val="ListBullet"/>
       </w:pPr>
       <w:r>
@@ -5006,6 +6997,69 @@
     </w:p>
     <w:p>
       <w:pPr>
+        <w:pStyle w:val="ListBullet2"/>
+        <w:ind w:left="720"/>
+      </w:pPr>
+      <w:r>
+        <w:t>Retrasos</w:t>
+      </w:r>
+    </w:p>
+    <w:p>
+      <w:pPr>
+        <w:pStyle w:val="ListBullet2"/>
+        <w:ind w:left="720"/>
+      </w:pPr>
+      <w:r>
+        <w:t>Averias</w:t>
+      </w:r>
+    </w:p>
+    <w:p>
+      <w:pPr>
+        <w:pStyle w:val="ListBullet2"/>
+        <w:ind w:left="720"/>
+      </w:pPr>
+      <w:r>
+        <w:t>Accidentes</w:t>
+      </w:r>
+    </w:p>
+    <w:p>
+      <w:pPr>
+        <w:pStyle w:val="ListBullet2"/>
+        <w:ind w:left="720"/>
+      </w:pPr>
+      <w:r>
+        <w:t>Cliente ausente</w:t>
+      </w:r>
+    </w:p>
+    <w:p>
+      <w:pPr>
+        <w:pStyle w:val="ListBullet2"/>
+        <w:ind w:left="720"/>
+      </w:pPr>
+      <w:r>
+        <w:t>Direccion incorrecta</w:t>
+      </w:r>
+    </w:p>
+    <w:p>
+      <w:pPr>
+        <w:pStyle w:val="ListBullet2"/>
+        <w:ind w:left="720"/>
+      </w:pPr>
+      <w:r>
+        <w:t>Producto danado</w:t>
+      </w:r>
+    </w:p>
+    <w:p>
+      <w:pPr>
+        <w:pStyle w:val="ListBullet2"/>
+        <w:ind w:left="720"/>
+      </w:pPr>
+      <w:r>
+        <w:t>Devoluciones</w:t>
+      </w:r>
+    </w:p>
+    <w:p>
+      <w:pPr>
         <w:pStyle w:val="ListBullet"/>
       </w:pPr>
       <w:r>
@@ -5014,6 +7068,60 @@
     </w:p>
     <w:p>
       <w:pPr>
+        <w:pStyle w:val="ListBullet2"/>
+        <w:ind w:left="720"/>
+      </w:pPr>
+      <w:r>
+        <w:t>Transportistas</w:t>
+      </w:r>
+    </w:p>
+    <w:p>
+      <w:pPr>
+        <w:pStyle w:val="ListBullet2"/>
+        <w:ind w:left="720"/>
+      </w:pPr>
+      <w:r>
+        <w:t>Proveedores de transporte</w:t>
+      </w:r>
+    </w:p>
+    <w:p>
+      <w:pPr>
+        <w:pStyle w:val="ListBullet2"/>
+        <w:ind w:left="720"/>
+      </w:pPr>
+      <w:r>
+        <w:t>Tarifarios</w:t>
+      </w:r>
+    </w:p>
+    <w:p>
+      <w:pPr>
+        <w:pStyle w:val="ListBullet2"/>
+        <w:ind w:left="720"/>
+      </w:pPr>
+      <w:r>
+        <w:t>Contratos</w:t>
+      </w:r>
+    </w:p>
+    <w:p>
+      <w:pPr>
+        <w:pStyle w:val="ListBullet2"/>
+        <w:ind w:left="720"/>
+      </w:pPr>
+      <w:r>
+        <w:t>Servicios</w:t>
+      </w:r>
+    </w:p>
+    <w:p>
+      <w:pPr>
+        <w:pStyle w:val="ListBullet2"/>
+        <w:ind w:left="720"/>
+      </w:pPr>
+      <w:r>
+        <w:t>Evaluacion</w:t>
+      </w:r>
+    </w:p>
+    <w:p>
+      <w:pPr>
         <w:pStyle w:val="ListBullet"/>
       </w:pPr>
       <w:r>
@@ -5022,6 +7130,78 @@
     </w:p>
     <w:p>
       <w:pPr>
+        <w:pStyle w:val="ListBullet2"/>
+        <w:ind w:left="720"/>
+      </w:pPr>
+      <w:r>
+        <w:t>Costo por viaje</w:t>
+      </w:r>
+    </w:p>
+    <w:p>
+      <w:pPr>
+        <w:pStyle w:val="ListBullet2"/>
+        <w:ind w:left="720"/>
+      </w:pPr>
+      <w:r>
+        <w:t>Costo por kilometro</w:t>
+      </w:r>
+    </w:p>
+    <w:p>
+      <w:pPr>
+        <w:pStyle w:val="ListBullet2"/>
+        <w:ind w:left="720"/>
+      </w:pPr>
+      <w:r>
+        <w:t>Costo por entrega</w:t>
+      </w:r>
+    </w:p>
+    <w:p>
+      <w:pPr>
+        <w:pStyle w:val="ListBullet2"/>
+        <w:ind w:left="720"/>
+      </w:pPr>
+      <w:r>
+        <w:t>Combustible</w:t>
+      </w:r>
+    </w:p>
+    <w:p>
+      <w:pPr>
+        <w:pStyle w:val="ListBullet2"/>
+        <w:ind w:left="720"/>
+      </w:pPr>
+      <w:r>
+        <w:t>Peajes</w:t>
+      </w:r>
+    </w:p>
+    <w:p>
+      <w:pPr>
+        <w:pStyle w:val="ListBullet2"/>
+        <w:ind w:left="720"/>
+      </w:pPr>
+      <w:r>
+        <w:t>Viaticos</w:t>
+      </w:r>
+    </w:p>
+    <w:p>
+      <w:pPr>
+        <w:pStyle w:val="ListBullet2"/>
+        <w:ind w:left="720"/>
+      </w:pPr>
+      <w:r>
+        <w:t>Fletes</w:t>
+      </w:r>
+    </w:p>
+    <w:p>
+      <w:pPr>
+        <w:pStyle w:val="ListBullet2"/>
+        <w:ind w:left="720"/>
+      </w:pPr>
+      <w:r>
+        <w:t>Liquidacion</w:t>
+      </w:r>
+    </w:p>
+    <w:p>
+      <w:pPr>
         <w:pStyle w:val="ListBullet"/>
       </w:pPr>
       <w:r>
@@ -5030,6 +7210,69 @@
     </w:p>
     <w:p>
       <w:pPr>
+        <w:pStyle w:val="ListBullet2"/>
+        <w:ind w:left="720"/>
+      </w:pPr>
+      <w:r>
+        <w:t>Entregas a tiempo</w:t>
+      </w:r>
+    </w:p>
+    <w:p>
+      <w:pPr>
+        <w:pStyle w:val="ListBullet2"/>
+        <w:ind w:left="720"/>
+      </w:pPr>
+      <w:r>
+        <w:t>Costo por kilometro</w:t>
+      </w:r>
+    </w:p>
+    <w:p>
+      <w:pPr>
+        <w:pStyle w:val="ListBullet2"/>
+        <w:ind w:left="720"/>
+      </w:pPr>
+      <w:r>
+        <w:t>Costo por entrega</w:t>
+      </w:r>
+    </w:p>
+    <w:p>
+      <w:pPr>
+        <w:pStyle w:val="ListBullet2"/>
+        <w:ind w:left="720"/>
+      </w:pPr>
+      <w:r>
+        <w:t>Utilizacion de flota</w:t>
+      </w:r>
+    </w:p>
+    <w:p>
+      <w:pPr>
+        <w:pStyle w:val="ListBullet2"/>
+        <w:ind w:left="720"/>
+      </w:pPr>
+      <w:r>
+        <w:t>Productividad</w:t>
+      </w:r>
+    </w:p>
+    <w:p>
+      <w:pPr>
+        <w:pStyle w:val="ListBullet2"/>
+        <w:ind w:left="720"/>
+      </w:pPr>
+      <w:r>
+        <w:t>Kilometros recorridos</w:t>
+      </w:r>
+    </w:p>
+    <w:p>
+      <w:pPr>
+        <w:pStyle w:val="ListBullet2"/>
+        <w:ind w:left="720"/>
+      </w:pPr>
+      <w:r>
+        <w:t>Rentabilidad por ruta</w:t>
+      </w:r>
+    </w:p>
+    <w:p>
+      <w:pPr>
         <w:pStyle w:val="ListBullet"/>
       </w:pPr>
       <w:r>
@@ -5038,6 +7281,132 @@
     </w:p>
     <w:p>
       <w:pPr>
+        <w:pStyle w:val="ListBullet2"/>
+        <w:ind w:left="720"/>
+      </w:pPr>
+      <w:r>
+        <w:t>Usuarios</w:t>
+      </w:r>
+    </w:p>
+    <w:p>
+      <w:pPr>
+        <w:pStyle w:val="ListBullet2"/>
+        <w:ind w:left="720"/>
+      </w:pPr>
+      <w:r>
+        <w:t>Roles</w:t>
+      </w:r>
+    </w:p>
+    <w:p>
+      <w:pPr>
+        <w:pStyle w:val="ListBullet2"/>
+        <w:ind w:left="720"/>
+      </w:pPr>
+      <w:r>
+        <w:t>Permisos</w:t>
+      </w:r>
+    </w:p>
+    <w:p>
+      <w:pPr>
+        <w:pStyle w:val="ListBullet2"/>
+        <w:ind w:left="720"/>
+      </w:pPr>
+      <w:r>
+        <w:t>Flujos de aprobacion</w:t>
+      </w:r>
+    </w:p>
+    <w:p>
+      <w:pPr>
+        <w:pStyle w:val="ListBullet2"/>
+        <w:ind w:left="720"/>
+      </w:pPr>
+      <w:r>
+        <w:t>Auditoria</w:t>
+      </w:r>
+    </w:p>
+    <w:p>
+      <w:pPr>
+        <w:pStyle w:val="ListBullet2"/>
+        <w:ind w:left="720"/>
+      </w:pPr>
+      <w:r>
+        <w:t>Bitacora de cambios</w:t>
+      </w:r>
+    </w:p>
+    <w:p>
+      <w:pPr>
+        <w:pStyle w:val="ListBullet2"/>
+        <w:ind w:left="720"/>
+      </w:pPr>
+      <w:r>
+        <w:t>Parametros de transporte</w:t>
+      </w:r>
+    </w:p>
+    <w:p>
+      <w:pPr>
+        <w:pStyle w:val="ListBullet2"/>
+        <w:ind w:left="720"/>
+      </w:pPr>
+      <w:r>
+        <w:t>Tipos de vehiculo</w:t>
+      </w:r>
+    </w:p>
+    <w:p>
+      <w:pPr>
+        <w:pStyle w:val="ListBullet2"/>
+        <w:ind w:left="720"/>
+      </w:pPr>
+      <w:r>
+        <w:t>Tipos de servicio</w:t>
+      </w:r>
+    </w:p>
+    <w:p>
+      <w:pPr>
+        <w:pStyle w:val="ListBullet2"/>
+        <w:ind w:left="720"/>
+      </w:pPr>
+      <w:r>
+        <w:t>Zonas de reparto</w:t>
+      </w:r>
+    </w:p>
+    <w:p>
+      <w:pPr>
+        <w:pStyle w:val="ListBullet2"/>
+        <w:ind w:left="720"/>
+      </w:pPr>
+      <w:r>
+        <w:t>Tarifarios base</w:t>
+      </w:r>
+    </w:p>
+    <w:p>
+      <w:pPr>
+        <w:pStyle w:val="ListBullet2"/>
+        <w:ind w:left="720"/>
+      </w:pPr>
+      <w:r>
+        <w:t>Motivos de incidencia</w:t>
+      </w:r>
+    </w:p>
+    <w:p>
+      <w:pPr>
+        <w:pStyle w:val="ListBullet2"/>
+        <w:ind w:left="720"/>
+      </w:pPr>
+      <w:r>
+        <w:t>Estados de transporte</w:t>
+      </w:r>
+    </w:p>
+    <w:p>
+      <w:pPr>
+        <w:pStyle w:val="ListBullet2"/>
+        <w:ind w:left="720"/>
+      </w:pPr>
+      <w:r>
+        <w:t>Estados de entrega</w:t>
+      </w:r>
+    </w:p>
+    <w:p>
+      <w:pPr>
         <w:pStyle w:val="Heading2"/>
       </w:pPr>
       <w:r>
@@ -5054,6 +7423,33 @@
     </w:p>
     <w:p>
       <w:pPr>
+        <w:pStyle w:val="ListBullet2"/>
+        <w:ind w:left="720"/>
+      </w:pPr>
+      <w:r>
+        <w:t>Documentos</w:t>
+      </w:r>
+    </w:p>
+    <w:p>
+      <w:pPr>
+        <w:pStyle w:val="ListBullet2"/>
+        <w:ind w:left="720"/>
+      </w:pPr>
+      <w:r>
+        <w:t>Carpetas</w:t>
+      </w:r>
+    </w:p>
+    <w:p>
+      <w:pPr>
+        <w:pStyle w:val="ListBullet2"/>
+        <w:ind w:left="720"/>
+      </w:pPr>
+      <w:r>
+        <w:t>Metadatos</w:t>
+      </w:r>
+    </w:p>
+    <w:p>
+      <w:pPr>
         <w:pStyle w:val="ListBullet"/>
       </w:pPr>
       <w:r>
@@ -5062,6 +7458,60 @@
     </w:p>
     <w:p>
       <w:pPr>
+        <w:pStyle w:val="ListBullet2"/>
+        <w:ind w:left="720"/>
+      </w:pPr>
+      <w:r>
+        <w:t>Carga de documentos</w:t>
+      </w:r>
+    </w:p>
+    <w:p>
+      <w:pPr>
+        <w:pStyle w:val="ListBullet2"/>
+        <w:ind w:left="720"/>
+      </w:pPr>
+      <w:r>
+        <w:t>Digitalizacion</w:t>
+      </w:r>
+    </w:p>
+    <w:p>
+      <w:pPr>
+        <w:pStyle w:val="ListBullet2"/>
+        <w:ind w:left="720"/>
+      </w:pPr>
+      <w:r>
+        <w:t>Clasificacion</w:t>
+      </w:r>
+    </w:p>
+    <w:p>
+      <w:pPr>
+        <w:pStyle w:val="ListBullet2"/>
+        <w:ind w:left="720"/>
+      </w:pPr>
+      <w:r>
+        <w:t>Indexacion</w:t>
+      </w:r>
+    </w:p>
+    <w:p>
+      <w:pPr>
+        <w:pStyle w:val="ListBullet2"/>
+        <w:ind w:left="720"/>
+      </w:pPr>
+      <w:r>
+        <w:t>Versiones</w:t>
+      </w:r>
+    </w:p>
+    <w:p>
+      <w:pPr>
+        <w:pStyle w:val="ListBullet2"/>
+        <w:ind w:left="720"/>
+      </w:pPr>
+      <w:r>
+        <w:t>Historial</w:t>
+      </w:r>
+    </w:p>
+    <w:p>
+      <w:pPr>
         <w:pStyle w:val="ListBullet"/>
       </w:pPr>
       <w:r>
@@ -5070,6 +7520,60 @@
     </w:p>
     <w:p>
       <w:pPr>
+        <w:pStyle w:val="ListBullet2"/>
+        <w:ind w:left="720"/>
+      </w:pPr>
+      <w:r>
+        <w:t>Busqueda por nombre</w:t>
+      </w:r>
+    </w:p>
+    <w:p>
+      <w:pPr>
+        <w:pStyle w:val="ListBullet2"/>
+        <w:ind w:left="720"/>
+      </w:pPr>
+      <w:r>
+        <w:t>Busqueda por contenido</w:t>
+      </w:r>
+    </w:p>
+    <w:p>
+      <w:pPr>
+        <w:pStyle w:val="ListBullet2"/>
+        <w:ind w:left="720"/>
+      </w:pPr>
+      <w:r>
+        <w:t>Filtros</w:t>
+      </w:r>
+    </w:p>
+    <w:p>
+      <w:pPr>
+        <w:pStyle w:val="ListBullet2"/>
+        <w:ind w:left="720"/>
+      </w:pPr>
+      <w:r>
+        <w:t>Metadatos</w:t>
+      </w:r>
+    </w:p>
+    <w:p>
+      <w:pPr>
+        <w:pStyle w:val="ListBullet2"/>
+        <w:ind w:left="720"/>
+      </w:pPr>
+      <w:r>
+        <w:t>Etiquetas</w:t>
+      </w:r>
+    </w:p>
+    <w:p>
+      <w:pPr>
+        <w:pStyle w:val="ListBullet2"/>
+        <w:ind w:left="720"/>
+      </w:pPr>
+      <w:r>
+        <w:t>OCR</w:t>
+      </w:r>
+    </w:p>
+    <w:p>
+      <w:pPr>
         <w:pStyle w:val="ListBullet"/>
       </w:pPr>
       <w:r>
@@ -5078,6 +7582,51 @@
     </w:p>
     <w:p>
       <w:pPr>
+        <w:pStyle w:val="ListBullet2"/>
+        <w:ind w:left="720"/>
+      </w:pPr>
+      <w:r>
+        <w:t>Versiones</w:t>
+      </w:r>
+    </w:p>
+    <w:p>
+      <w:pPr>
+        <w:pStyle w:val="ListBullet2"/>
+        <w:ind w:left="720"/>
+      </w:pPr>
+      <w:r>
+        <w:t>Control de cambios</w:t>
+      </w:r>
+    </w:p>
+    <w:p>
+      <w:pPr>
+        <w:pStyle w:val="ListBullet2"/>
+        <w:ind w:left="720"/>
+      </w:pPr>
+      <w:r>
+        <w:t>Comparacion</w:t>
+      </w:r>
+    </w:p>
+    <w:p>
+      <w:pPr>
+        <w:pStyle w:val="ListBullet2"/>
+        <w:ind w:left="720"/>
+      </w:pPr>
+      <w:r>
+        <w:t>Restauracion</w:t>
+      </w:r>
+    </w:p>
+    <w:p>
+      <w:pPr>
+        <w:pStyle w:val="ListBullet2"/>
+        <w:ind w:left="720"/>
+      </w:pPr>
+      <w:r>
+        <w:t>Historial</w:t>
+      </w:r>
+    </w:p>
+    <w:p>
+      <w:pPr>
         <w:pStyle w:val="ListBullet"/>
       </w:pPr>
       <w:r>
@@ -5086,6 +7635,60 @@
     </w:p>
     <w:p>
       <w:pPr>
+        <w:pStyle w:val="ListBullet2"/>
+        <w:ind w:left="720"/>
+      </w:pPr>
+      <w:r>
+        <w:t>Creacion de flujo</w:t>
+      </w:r>
+    </w:p>
+    <w:p>
+      <w:pPr>
+        <w:pStyle w:val="ListBullet2"/>
+        <w:ind w:left="720"/>
+      </w:pPr>
+      <w:r>
+        <w:t>Aprobaciones</w:t>
+      </w:r>
+    </w:p>
+    <w:p>
+      <w:pPr>
+        <w:pStyle w:val="ListBullet2"/>
+        <w:ind w:left="720"/>
+      </w:pPr>
+      <w:r>
+        <w:t>Revisiones</w:t>
+      </w:r>
+    </w:p>
+    <w:p>
+      <w:pPr>
+        <w:pStyle w:val="ListBullet2"/>
+        <w:ind w:left="720"/>
+      </w:pPr>
+      <w:r>
+        <w:t>Rechazos</w:t>
+      </w:r>
+    </w:p>
+    <w:p>
+      <w:pPr>
+        <w:pStyle w:val="ListBullet2"/>
+        <w:ind w:left="720"/>
+      </w:pPr>
+      <w:r>
+        <w:t>Delegaciones</w:t>
+      </w:r>
+    </w:p>
+    <w:p>
+      <w:pPr>
+        <w:pStyle w:val="ListBullet2"/>
+        <w:ind w:left="720"/>
+      </w:pPr>
+      <w:r>
+        <w:t>Notificaciones</w:t>
+      </w:r>
+    </w:p>
+    <w:p>
+      <w:pPr>
         <w:pStyle w:val="ListBullet"/>
       </w:pPr>
       <w:r>
@@ -5094,6 +7697,60 @@
     </w:p>
     <w:p>
       <w:pPr>
+        <w:pStyle w:val="ListBullet2"/>
+        <w:ind w:left="720"/>
+      </w:pPr>
+      <w:r>
+        <w:t>Firma de documentos</w:t>
+      </w:r>
+    </w:p>
+    <w:p>
+      <w:pPr>
+        <w:pStyle w:val="ListBullet2"/>
+        <w:ind w:left="720"/>
+      </w:pPr>
+      <w:r>
+        <w:t>Solicitud de firma</w:t>
+      </w:r>
+    </w:p>
+    <w:p>
+      <w:pPr>
+        <w:pStyle w:val="ListBullet2"/>
+        <w:ind w:left="720"/>
+      </w:pPr>
+      <w:r>
+        <w:t>Firmantes</w:t>
+      </w:r>
+    </w:p>
+    <w:p>
+      <w:pPr>
+        <w:pStyle w:val="ListBullet2"/>
+        <w:ind w:left="720"/>
+      </w:pPr>
+      <w:r>
+        <w:t>Orden de firma</w:t>
+      </w:r>
+    </w:p>
+    <w:p>
+      <w:pPr>
+        <w:pStyle w:val="ListBullet2"/>
+        <w:ind w:left="720"/>
+      </w:pPr>
+      <w:r>
+        <w:t>Estado de firma</w:t>
+      </w:r>
+    </w:p>
+    <w:p>
+      <w:pPr>
+        <w:pStyle w:val="ListBullet2"/>
+        <w:ind w:left="720"/>
+      </w:pPr>
+      <w:r>
+        <w:t>Evidencias</w:t>
+      </w:r>
+    </w:p>
+    <w:p>
+      <w:pPr>
         <w:pStyle w:val="ListBullet"/>
       </w:pPr>
       <w:r>
@@ -5102,6 +7759,51 @@
     </w:p>
     <w:p>
       <w:pPr>
+        <w:pStyle w:val="ListBullet2"/>
+        <w:ind w:left="720"/>
+      </w:pPr>
+      <w:r>
+        <w:t>Acceso por carpeta</w:t>
+      </w:r>
+    </w:p>
+    <w:p>
+      <w:pPr>
+        <w:pStyle w:val="ListBullet2"/>
+        <w:ind w:left="720"/>
+      </w:pPr>
+      <w:r>
+        <w:t>Acceso por documento</w:t>
+      </w:r>
+    </w:p>
+    <w:p>
+      <w:pPr>
+        <w:pStyle w:val="ListBullet2"/>
+        <w:ind w:left="720"/>
+      </w:pPr>
+      <w:r>
+        <w:t>Restricciones</w:t>
+      </w:r>
+    </w:p>
+    <w:p>
+      <w:pPr>
+        <w:pStyle w:val="ListBullet2"/>
+        <w:ind w:left="720"/>
+      </w:pPr>
+      <w:r>
+        <w:t>Clasificacion de confidencialidad</w:t>
+      </w:r>
+    </w:p>
+    <w:p>
+      <w:pPr>
+        <w:pStyle w:val="ListBullet2"/>
+        <w:ind w:left="720"/>
+      </w:pPr>
+      <w:r>
+        <w:t>Auditoria documental</w:t>
+      </w:r>
+    </w:p>
+    <w:p>
+      <w:pPr>
         <w:pStyle w:val="ListBullet"/>
       </w:pPr>
       <w:r>
@@ -5110,6 +7812,42 @@
     </w:p>
     <w:p>
       <w:pPr>
+        <w:pStyle w:val="ListBullet2"/>
+        <w:ind w:left="720"/>
+      </w:pPr>
+      <w:r>
+        <w:t>Vencimientos</w:t>
+      </w:r>
+    </w:p>
+    <w:p>
+      <w:pPr>
+        <w:pStyle w:val="ListBullet2"/>
+        <w:ind w:left="720"/>
+      </w:pPr>
+      <w:r>
+        <w:t>Archivo historico</w:t>
+      </w:r>
+    </w:p>
+    <w:p>
+      <w:pPr>
+        <w:pStyle w:val="ListBullet2"/>
+        <w:ind w:left="720"/>
+      </w:pPr>
+      <w:r>
+        <w:t>Eliminacion</w:t>
+      </w:r>
+    </w:p>
+    <w:p>
+      <w:pPr>
+        <w:pStyle w:val="ListBullet2"/>
+        <w:ind w:left="720"/>
+      </w:pPr>
+      <w:r>
+        <w:t>Recuperacion</w:t>
+      </w:r>
+    </w:p>
+    <w:p>
+      <w:pPr>
         <w:pStyle w:val="ListBullet"/>
       </w:pPr>
       <w:r>
@@ -5118,6 +7856,69 @@
     </w:p>
     <w:p>
       <w:pPr>
+        <w:pStyle w:val="ListBullet2"/>
+        <w:ind w:left="720"/>
+      </w:pPr>
+      <w:r>
+        <w:t>ERP</w:t>
+      </w:r>
+    </w:p>
+    <w:p>
+      <w:pPr>
+        <w:pStyle w:val="ListBullet2"/>
+        <w:ind w:left="720"/>
+      </w:pPr>
+      <w:r>
+        <w:t>WMS</w:t>
+      </w:r>
+    </w:p>
+    <w:p>
+      <w:pPr>
+        <w:pStyle w:val="ListBullet2"/>
+        <w:ind w:left="720"/>
+      </w:pPr>
+      <w:r>
+        <w:t>TMS</w:t>
+      </w:r>
+    </w:p>
+    <w:p>
+      <w:pPr>
+        <w:pStyle w:val="ListBullet2"/>
+        <w:ind w:left="720"/>
+      </w:pPr>
+      <w:r>
+        <w:t>RRHH</w:t>
+      </w:r>
+    </w:p>
+    <w:p>
+      <w:pPr>
+        <w:pStyle w:val="ListBullet2"/>
+        <w:ind w:left="720"/>
+      </w:pPr>
+      <w:r>
+        <w:t>API</w:t>
+      </w:r>
+    </w:p>
+    <w:p>
+      <w:pPr>
+        <w:pStyle w:val="ListBullet2"/>
+        <w:ind w:left="720"/>
+      </w:pPr>
+      <w:r>
+        <w:t>Correo electronico</w:t>
+      </w:r>
+    </w:p>
+    <w:p>
+      <w:pPr>
+        <w:pStyle w:val="ListBullet2"/>
+        <w:ind w:left="720"/>
+      </w:pPr>
+      <w:r>
+        <w:t>Almacenamiento externo</w:t>
+      </w:r>
+    </w:p>
+    <w:p>
+      <w:pPr>
         <w:pStyle w:val="ListBullet"/>
       </w:pPr>
       <w:r>
@@ -5126,6 +7927,60 @@
     </w:p>
     <w:p>
       <w:pPr>
+        <w:pStyle w:val="ListBullet2"/>
+        <w:ind w:left="720"/>
+      </w:pPr>
+      <w:r>
+        <w:t>Documentos creados</w:t>
+      </w:r>
+    </w:p>
+    <w:p>
+      <w:pPr>
+        <w:pStyle w:val="ListBullet2"/>
+        <w:ind w:left="720"/>
+      </w:pPr>
+      <w:r>
+        <w:t>Documentos modificados</w:t>
+      </w:r>
+    </w:p>
+    <w:p>
+      <w:pPr>
+        <w:pStyle w:val="ListBullet2"/>
+        <w:ind w:left="720"/>
+      </w:pPr>
+      <w:r>
+        <w:t>Documentos vencidos</w:t>
+      </w:r>
+    </w:p>
+    <w:p>
+      <w:pPr>
+        <w:pStyle w:val="ListBullet2"/>
+        <w:ind w:left="720"/>
+      </w:pPr>
+      <w:r>
+        <w:t>Firmas pendientes</w:t>
+      </w:r>
+    </w:p>
+    <w:p>
+      <w:pPr>
+        <w:pStyle w:val="ListBullet2"/>
+        <w:ind w:left="720"/>
+      </w:pPr>
+      <w:r>
+        <w:t>Aprobaciones pendientes</w:t>
+      </w:r>
+    </w:p>
+    <w:p>
+      <w:pPr>
+        <w:pStyle w:val="ListBullet2"/>
+        <w:ind w:left="720"/>
+      </w:pPr>
+      <w:r>
+        <w:t>Reporte de auditoria</w:t>
+      </w:r>
+    </w:p>
+    <w:p>
+      <w:pPr>
         <w:pStyle w:val="ListBullet"/>
       </w:pPr>
       <w:r>
@@ -5134,6 +7989,132 @@
     </w:p>
     <w:p>
       <w:pPr>
+        <w:pStyle w:val="ListBullet2"/>
+        <w:ind w:left="720"/>
+      </w:pPr>
+      <w:r>
+        <w:t>Usuarios</w:t>
+      </w:r>
+    </w:p>
+    <w:p>
+      <w:pPr>
+        <w:pStyle w:val="ListBullet2"/>
+        <w:ind w:left="720"/>
+      </w:pPr>
+      <w:r>
+        <w:t>Roles</w:t>
+      </w:r>
+    </w:p>
+    <w:p>
+      <w:pPr>
+        <w:pStyle w:val="ListBullet2"/>
+        <w:ind w:left="720"/>
+      </w:pPr>
+      <w:r>
+        <w:t>Permisos</w:t>
+      </w:r>
+    </w:p>
+    <w:p>
+      <w:pPr>
+        <w:pStyle w:val="ListBullet2"/>
+        <w:ind w:left="720"/>
+      </w:pPr>
+      <w:r>
+        <w:t>Flujos de aprobacion</w:t>
+      </w:r>
+    </w:p>
+    <w:p>
+      <w:pPr>
+        <w:pStyle w:val="ListBullet2"/>
+        <w:ind w:left="720"/>
+      </w:pPr>
+      <w:r>
+        <w:t>Auditoria</w:t>
+      </w:r>
+    </w:p>
+    <w:p>
+      <w:pPr>
+        <w:pStyle w:val="ListBullet2"/>
+        <w:ind w:left="720"/>
+      </w:pPr>
+      <w:r>
+        <w:t>Bitacora de cambios</w:t>
+      </w:r>
+    </w:p>
+    <w:p>
+      <w:pPr>
+        <w:pStyle w:val="ListBullet2"/>
+        <w:ind w:left="720"/>
+      </w:pPr>
+      <w:r>
+        <w:t>Parametros documentales</w:t>
+      </w:r>
+    </w:p>
+    <w:p>
+      <w:pPr>
+        <w:pStyle w:val="ListBullet2"/>
+        <w:ind w:left="720"/>
+      </w:pPr>
+      <w:r>
+        <w:t>Categorias documentales</w:t>
+      </w:r>
+    </w:p>
+    <w:p>
+      <w:pPr>
+        <w:pStyle w:val="ListBullet2"/>
+        <w:ind w:left="720"/>
+      </w:pPr>
+      <w:r>
+        <w:t>Tipos de documento</w:t>
+      </w:r>
+    </w:p>
+    <w:p>
+      <w:pPr>
+        <w:pStyle w:val="ListBullet2"/>
+        <w:ind w:left="720"/>
+      </w:pPr>
+      <w:r>
+        <w:t>Etiquetas</w:t>
+      </w:r>
+    </w:p>
+    <w:p>
+      <w:pPr>
+        <w:pStyle w:val="ListBullet2"/>
+        <w:ind w:left="720"/>
+      </w:pPr>
+      <w:r>
+        <w:t>Metadatos</w:t>
+      </w:r>
+    </w:p>
+    <w:p>
+      <w:pPr>
+        <w:pStyle w:val="ListBullet2"/>
+        <w:ind w:left="720"/>
+      </w:pPr>
+      <w:r>
+        <w:t>Politicas de retencion</w:t>
+      </w:r>
+    </w:p>
+    <w:p>
+      <w:pPr>
+        <w:pStyle w:val="ListBullet2"/>
+        <w:ind w:left="720"/>
+      </w:pPr>
+      <w:r>
+        <w:t>Niveles de confidencialidad</w:t>
+      </w:r>
+    </w:p>
+    <w:p>
+      <w:pPr>
+        <w:pStyle w:val="ListBullet2"/>
+        <w:ind w:left="720"/>
+      </w:pPr>
+      <w:r>
+        <w:t>Estados de aprobacion</w:t>
+      </w:r>
+    </w:p>
+    <w:p>
+      <w:pPr>
         <w:pStyle w:val="Heading2"/>
       </w:pPr>
       <w:r>
@@ -5150,6 +8131,87 @@
     </w:p>
     <w:p>
       <w:pPr>
+        <w:pStyle w:val="ListBullet2"/>
+        <w:ind w:left="720"/>
+      </w:pPr>
+      <w:r>
+        <w:t>Ficha del empleado</w:t>
+      </w:r>
+    </w:p>
+    <w:p>
+      <w:pPr>
+        <w:pStyle w:val="ListBullet2"/>
+        <w:ind w:left="720"/>
+      </w:pPr>
+      <w:r>
+        <w:t>Datos personales</w:t>
+      </w:r>
+    </w:p>
+    <w:p>
+      <w:pPr>
+        <w:pStyle w:val="ListBullet2"/>
+        <w:ind w:left="720"/>
+      </w:pPr>
+      <w:r>
+        <w:t>Datos laborales</w:t>
+      </w:r>
+    </w:p>
+    <w:p>
+      <w:pPr>
+        <w:pStyle w:val="ListBullet2"/>
+        <w:ind w:left="720"/>
+      </w:pPr>
+      <w:r>
+        <w:t>Contactos</w:t>
+      </w:r>
+    </w:p>
+    <w:p>
+      <w:pPr>
+        <w:pStyle w:val="ListBullet2"/>
+        <w:ind w:left="720"/>
+      </w:pPr>
+      <w:r>
+        <w:t>Datos bancarios</w:t>
+      </w:r>
+    </w:p>
+    <w:p>
+      <w:pPr>
+        <w:pStyle w:val="ListBullet2"/>
+        <w:ind w:left="720"/>
+      </w:pPr>
+      <w:r>
+        <w:t>Datos familiares</w:t>
+      </w:r>
+    </w:p>
+    <w:p>
+      <w:pPr>
+        <w:pStyle w:val="ListBullet2"/>
+        <w:ind w:left="720"/>
+      </w:pPr>
+      <w:r>
+        <w:t>Documentos</w:t>
+      </w:r>
+    </w:p>
+    <w:p>
+      <w:pPr>
+        <w:pStyle w:val="ListBullet2"/>
+        <w:ind w:left="720"/>
+      </w:pPr>
+      <w:r>
+        <w:t>Historial laboral</w:t>
+      </w:r>
+    </w:p>
+    <w:p>
+      <w:pPr>
+        <w:pStyle w:val="ListBullet2"/>
+        <w:ind w:left="720"/>
+      </w:pPr>
+      <w:r>
+        <w:t>Historial salarial</w:t>
+      </w:r>
+    </w:p>
+    <w:p>
+      <w:pPr>
         <w:pStyle w:val="ListBullet"/>
       </w:pPr>
       <w:r>
@@ -5158,6 +8220,42 @@
     </w:p>
     <w:p>
       <w:pPr>
+        <w:pStyle w:val="ListBullet2"/>
+        <w:ind w:left="720"/>
+      </w:pPr>
+      <w:r>
+        <w:t>Organigrama</w:t>
+      </w:r>
+    </w:p>
+    <w:p>
+      <w:pPr>
+        <w:pStyle w:val="ListBullet2"/>
+        <w:ind w:left="720"/>
+      </w:pPr>
+      <w:r>
+        <w:t>Jerarquias</w:t>
+      </w:r>
+    </w:p>
+    <w:p>
+      <w:pPr>
+        <w:pStyle w:val="ListBullet2"/>
+        <w:ind w:left="720"/>
+      </w:pPr>
+      <w:r>
+        <w:t>Asignacion organizacional</w:t>
+      </w:r>
+    </w:p>
+    <w:p>
+      <w:pPr>
+        <w:pStyle w:val="ListBullet2"/>
+        <w:ind w:left="720"/>
+      </w:pPr>
+      <w:r>
+        <w:t>Estructura de equipos</w:t>
+      </w:r>
+    </w:p>
+    <w:p>
+      <w:pPr>
         <w:pStyle w:val="ListBullet"/>
       </w:pPr>
       <w:r>
@@ -5166,6 +8264,87 @@
     </w:p>
     <w:p>
       <w:pPr>
+        <w:pStyle w:val="ListBullet2"/>
+        <w:ind w:left="720"/>
+      </w:pPr>
+      <w:r>
+        <w:t>Requisiciones</w:t>
+      </w:r>
+    </w:p>
+    <w:p>
+      <w:pPr>
+        <w:pStyle w:val="ListBullet2"/>
+        <w:ind w:left="720"/>
+      </w:pPr>
+      <w:r>
+        <w:t>Vacantes</w:t>
+      </w:r>
+    </w:p>
+    <w:p>
+      <w:pPr>
+        <w:pStyle w:val="ListBullet2"/>
+        <w:ind w:left="720"/>
+      </w:pPr>
+      <w:r>
+        <w:t>Postulantes</w:t>
+      </w:r>
+    </w:p>
+    <w:p>
+      <w:pPr>
+        <w:pStyle w:val="ListBullet2"/>
+        <w:ind w:left="720"/>
+      </w:pPr>
+      <w:r>
+        <w:t>CV</w:t>
+      </w:r>
+    </w:p>
+    <w:p>
+      <w:pPr>
+        <w:pStyle w:val="ListBullet2"/>
+        <w:ind w:left="720"/>
+      </w:pPr>
+      <w:r>
+        <w:t>Entrevistas</w:t>
+      </w:r>
+    </w:p>
+    <w:p>
+      <w:pPr>
+        <w:pStyle w:val="ListBullet2"/>
+        <w:ind w:left="720"/>
+      </w:pPr>
+      <w:r>
+        <w:t>Evaluaciones</w:t>
+      </w:r>
+    </w:p>
+    <w:p>
+      <w:pPr>
+        <w:pStyle w:val="ListBullet2"/>
+        <w:ind w:left="720"/>
+      </w:pPr>
+      <w:r>
+        <w:t>Pruebas</w:t>
+      </w:r>
+    </w:p>
+    <w:p>
+      <w:pPr>
+        <w:pStyle w:val="ListBullet2"/>
+        <w:ind w:left="720"/>
+      </w:pPr>
+      <w:r>
+        <w:t>Seleccion</w:t>
+      </w:r>
+    </w:p>
+    <w:p>
+      <w:pPr>
+        <w:pStyle w:val="ListBullet2"/>
+        <w:ind w:left="720"/>
+      </w:pPr>
+      <w:r>
+        <w:t>Contratacion</w:t>
+      </w:r>
+    </w:p>
+    <w:p>
+      <w:pPr>
         <w:pStyle w:val="ListBullet"/>
       </w:pPr>
       <w:r>
@@ -5174,6 +8353,69 @@
     </w:p>
     <w:p>
       <w:pPr>
+        <w:pStyle w:val="ListBullet2"/>
+        <w:ind w:left="720"/>
+      </w:pPr>
+      <w:r>
+        <w:t>Checklist de ingreso</w:t>
+      </w:r>
+    </w:p>
+    <w:p>
+      <w:pPr>
+        <w:pStyle w:val="ListBullet2"/>
+        <w:ind w:left="720"/>
+      </w:pPr>
+      <w:r>
+        <w:t>Documentacion</w:t>
+      </w:r>
+    </w:p>
+    <w:p>
+      <w:pPr>
+        <w:pStyle w:val="ListBullet2"/>
+        <w:ind w:left="720"/>
+      </w:pPr>
+      <w:r>
+        <w:t>Contratos</w:t>
+      </w:r>
+    </w:p>
+    <w:p>
+      <w:pPr>
+        <w:pStyle w:val="ListBullet2"/>
+        <w:ind w:left="720"/>
+      </w:pPr>
+      <w:r>
+        <w:t>Induccion</w:t>
+      </w:r>
+    </w:p>
+    <w:p>
+      <w:pPr>
+        <w:pStyle w:val="ListBullet2"/>
+        <w:ind w:left="720"/>
+      </w:pPr>
+      <w:r>
+        <w:t>Capacitacion inicial</w:t>
+      </w:r>
+    </w:p>
+    <w:p>
+      <w:pPr>
+        <w:pStyle w:val="ListBullet2"/>
+        <w:ind w:left="720"/>
+      </w:pPr>
+      <w:r>
+        <w:t>Asignacion de puesto</w:t>
+      </w:r>
+    </w:p>
+    <w:p>
+      <w:pPr>
+        <w:pStyle w:val="ListBullet2"/>
+        <w:ind w:left="720"/>
+      </w:pPr>
+      <w:r>
+        <w:t>Asignacion de equipos</w:t>
+      </w:r>
+    </w:p>
+    <w:p>
+      <w:pPr>
         <w:pStyle w:val="ListBullet"/>
       </w:pPr>
       <w:r>
@@ -5182,6 +8424,87 @@
     </w:p>
     <w:p>
       <w:pPr>
+        <w:pStyle w:val="ListBullet2"/>
+        <w:ind w:left="720"/>
+      </w:pPr>
+      <w:r>
+        <w:t>Marcaciones</w:t>
+      </w:r>
+    </w:p>
+    <w:p>
+      <w:pPr>
+        <w:pStyle w:val="ListBullet2"/>
+        <w:ind w:left="720"/>
+      </w:pPr>
+      <w:r>
+        <w:t>Entrada y salida</w:t>
+      </w:r>
+    </w:p>
+    <w:p>
+      <w:pPr>
+        <w:pStyle w:val="ListBullet2"/>
+        <w:ind w:left="720"/>
+      </w:pPr>
+      <w:r>
+        <w:t>Turnos</w:t>
+      </w:r>
+    </w:p>
+    <w:p>
+      <w:pPr>
+        <w:pStyle w:val="ListBullet2"/>
+        <w:ind w:left="720"/>
+      </w:pPr>
+      <w:r>
+        <w:t>Horarios</w:t>
+      </w:r>
+    </w:p>
+    <w:p>
+      <w:pPr>
+        <w:pStyle w:val="ListBullet2"/>
+        <w:ind w:left="720"/>
+      </w:pPr>
+      <w:r>
+        <w:t>Jornadas</w:t>
+      </w:r>
+    </w:p>
+    <w:p>
+      <w:pPr>
+        <w:pStyle w:val="ListBullet2"/>
+        <w:ind w:left="720"/>
+      </w:pPr>
+      <w:r>
+        <w:t>Tardanzas</w:t>
+      </w:r>
+    </w:p>
+    <w:p>
+      <w:pPr>
+        <w:pStyle w:val="ListBullet2"/>
+        <w:ind w:left="720"/>
+      </w:pPr>
+      <w:r>
+        <w:t>Inasistencias</w:t>
+      </w:r>
+    </w:p>
+    <w:p>
+      <w:pPr>
+        <w:pStyle w:val="ListBullet2"/>
+        <w:ind w:left="720"/>
+      </w:pPr>
+      <w:r>
+        <w:t>Horas extras</w:t>
+      </w:r>
+    </w:p>
+    <w:p>
+      <w:pPr>
+        <w:pStyle w:val="ListBullet2"/>
+        <w:ind w:left="720"/>
+      </w:pPr>
+      <w:r>
+        <w:t>Justificaciones</w:t>
+      </w:r>
+    </w:p>
+    <w:p>
+      <w:pPr>
         <w:pStyle w:val="ListBullet"/>
       </w:pPr>
       <w:r>
@@ -5190,6 +8513,78 @@
     </w:p>
     <w:p>
       <w:pPr>
+        <w:pStyle w:val="ListBullet2"/>
+        <w:ind w:left="720"/>
+      </w:pPr>
+      <w:r>
+        <w:t>Solicitudes</w:t>
+      </w:r>
+    </w:p>
+    <w:p>
+      <w:pPr>
+        <w:pStyle w:val="ListBullet2"/>
+        <w:ind w:left="720"/>
+      </w:pPr>
+      <w:r>
+        <w:t>Aprobaciones</w:t>
+      </w:r>
+    </w:p>
+    <w:p>
+      <w:pPr>
+        <w:pStyle w:val="ListBullet2"/>
+        <w:ind w:left="720"/>
+      </w:pPr>
+      <w:r>
+        <w:t>Calendario</w:t>
+      </w:r>
+    </w:p>
+    <w:p>
+      <w:pPr>
+        <w:pStyle w:val="ListBullet2"/>
+        <w:ind w:left="720"/>
+      </w:pPr>
+      <w:r>
+        <w:t>Saldos</w:t>
+      </w:r>
+    </w:p>
+    <w:p>
+      <w:pPr>
+        <w:pStyle w:val="ListBullet2"/>
+        <w:ind w:left="720"/>
+      </w:pPr>
+      <w:r>
+        <w:t>Vacaciones</w:t>
+      </w:r>
+    </w:p>
+    <w:p>
+      <w:pPr>
+        <w:pStyle w:val="ListBullet2"/>
+        <w:ind w:left="720"/>
+      </w:pPr>
+      <w:r>
+        <w:t>Permisos</w:t>
+      </w:r>
+    </w:p>
+    <w:p>
+      <w:pPr>
+        <w:pStyle w:val="ListBullet2"/>
+        <w:ind w:left="720"/>
+      </w:pPr>
+      <w:r>
+        <w:t>Licencias</w:t>
+      </w:r>
+    </w:p>
+    <w:p>
+      <w:pPr>
+        <w:pStyle w:val="ListBullet2"/>
+        <w:ind w:left="720"/>
+      </w:pPr>
+      <w:r>
+        <w:t>Ausencias</w:t>
+      </w:r>
+    </w:p>
+    <w:p>
+      <w:pPr>
         <w:pStyle w:val="ListBullet"/>
       </w:pPr>
       <w:r>
@@ -5198,6 +8593,105 @@
     </w:p>
     <w:p>
       <w:pPr>
+        <w:pStyle w:val="ListBullet2"/>
+        <w:ind w:left="720"/>
+      </w:pPr>
+      <w:r>
+        <w:t>Sueldos</w:t>
+      </w:r>
+    </w:p>
+    <w:p>
+      <w:pPr>
+        <w:pStyle w:val="ListBullet2"/>
+        <w:ind w:left="720"/>
+      </w:pPr>
+      <w:r>
+        <w:t>Conceptos salariales</w:t>
+      </w:r>
+    </w:p>
+    <w:p>
+      <w:pPr>
+        <w:pStyle w:val="ListBullet2"/>
+        <w:ind w:left="720"/>
+      </w:pPr>
+      <w:r>
+        <w:t>Bonificaciones</w:t>
+      </w:r>
+    </w:p>
+    <w:p>
+      <w:pPr>
+        <w:pStyle w:val="ListBullet2"/>
+        <w:ind w:left="720"/>
+      </w:pPr>
+      <w:r>
+        <w:t>Comisiones</w:t>
+      </w:r>
+    </w:p>
+    <w:p>
+      <w:pPr>
+        <w:pStyle w:val="ListBullet2"/>
+        <w:ind w:left="720"/>
+      </w:pPr>
+      <w:r>
+        <w:t>Horas extras</w:t>
+      </w:r>
+    </w:p>
+    <w:p>
+      <w:pPr>
+        <w:pStyle w:val="ListBullet2"/>
+        <w:ind w:left="720"/>
+      </w:pPr>
+      <w:r>
+        <w:t>Descuentos</w:t>
+      </w:r>
+    </w:p>
+    <w:p>
+      <w:pPr>
+        <w:pStyle w:val="ListBullet2"/>
+        <w:ind w:left="720"/>
+      </w:pPr>
+      <w:r>
+        <w:t>Retenciones</w:t>
+      </w:r>
+    </w:p>
+    <w:p>
+      <w:pPr>
+        <w:pStyle w:val="ListBullet2"/>
+        <w:ind w:left="720"/>
+      </w:pPr>
+      <w:r>
+        <w:t>Adelantos</w:t>
+      </w:r>
+    </w:p>
+    <w:p>
+      <w:pPr>
+        <w:pStyle w:val="ListBullet2"/>
+        <w:ind w:left="720"/>
+      </w:pPr>
+      <w:r>
+        <w:t>Prestamos</w:t>
+      </w:r>
+    </w:p>
+    <w:p>
+      <w:pPr>
+        <w:pStyle w:val="ListBullet2"/>
+        <w:ind w:left="720"/>
+      </w:pPr>
+      <w:r>
+        <w:t>Boletas</w:t>
+      </w:r>
+    </w:p>
+    <w:p>
+      <w:pPr>
+        <w:pStyle w:val="ListBullet2"/>
+        <w:ind w:left="720"/>
+      </w:pPr>
+      <w:r>
+        <w:t>Liquidaciones</w:t>
+      </w:r>
+    </w:p>
+    <w:p>
+      <w:pPr>
         <w:pStyle w:val="ListBullet"/>
       </w:pPr>
       <w:r>
@@ -5206,6 +8700,69 @@
     </w:p>
     <w:p>
       <w:pPr>
+        <w:pStyle w:val="ListBullet2"/>
+        <w:ind w:left="720"/>
+      </w:pPr>
+      <w:r>
+        <w:t>Evaluaciones</w:t>
+      </w:r>
+    </w:p>
+    <w:p>
+      <w:pPr>
+        <w:pStyle w:val="ListBullet2"/>
+        <w:ind w:left="720"/>
+      </w:pPr>
+      <w:r>
+        <w:t>Objetivos</w:t>
+      </w:r>
+    </w:p>
+    <w:p>
+      <w:pPr>
+        <w:pStyle w:val="ListBullet2"/>
+        <w:ind w:left="720"/>
+      </w:pPr>
+      <w:r>
+        <w:t>KPIs</w:t>
+      </w:r>
+    </w:p>
+    <w:p>
+      <w:pPr>
+        <w:pStyle w:val="ListBullet2"/>
+        <w:ind w:left="720"/>
+      </w:pPr>
+      <w:r>
+        <w:t>Competencias</w:t>
+      </w:r>
+    </w:p>
+    <w:p>
+      <w:pPr>
+        <w:pStyle w:val="ListBullet2"/>
+        <w:ind w:left="720"/>
+      </w:pPr>
+      <w:r>
+        <w:t>Evaluacion 360 grados</w:t>
+      </w:r>
+    </w:p>
+    <w:p>
+      <w:pPr>
+        <w:pStyle w:val="ListBullet2"/>
+        <w:ind w:left="720"/>
+      </w:pPr>
+      <w:r>
+        <w:t>Calificaciones</w:t>
+      </w:r>
+    </w:p>
+    <w:p>
+      <w:pPr>
+        <w:pStyle w:val="ListBullet2"/>
+        <w:ind w:left="720"/>
+      </w:pPr>
+      <w:r>
+        <w:t>Planes de mejora</w:t>
+      </w:r>
+    </w:p>
+    <w:p>
+      <w:pPr>
         <w:pStyle w:val="ListBullet"/>
       </w:pPr>
       <w:r>
@@ -5214,6 +8771,69 @@
     </w:p>
     <w:p>
       <w:pPr>
+        <w:pStyle w:val="ListBullet2"/>
+        <w:ind w:left="720"/>
+      </w:pPr>
+      <w:r>
+        <w:t>Cursos</w:t>
+      </w:r>
+    </w:p>
+    <w:p>
+      <w:pPr>
+        <w:pStyle w:val="ListBullet2"/>
+        <w:ind w:left="720"/>
+      </w:pPr>
+      <w:r>
+        <w:t>Planes de capacitacion</w:t>
+      </w:r>
+    </w:p>
+    <w:p>
+      <w:pPr>
+        <w:pStyle w:val="ListBullet2"/>
+        <w:ind w:left="720"/>
+      </w:pPr>
+      <w:r>
+        <w:t>Inscripciones</w:t>
+      </w:r>
+    </w:p>
+    <w:p>
+      <w:pPr>
+        <w:pStyle w:val="ListBullet2"/>
+        <w:ind w:left="720"/>
+      </w:pPr>
+      <w:r>
+        <w:t>Asistencia</w:t>
+      </w:r>
+    </w:p>
+    <w:p>
+      <w:pPr>
+        <w:pStyle w:val="ListBullet2"/>
+        <w:ind w:left="720"/>
+      </w:pPr>
+      <w:r>
+        <w:t>Evaluaciones</w:t>
+      </w:r>
+    </w:p>
+    <w:p>
+      <w:pPr>
+        <w:pStyle w:val="ListBullet2"/>
+        <w:ind w:left="720"/>
+      </w:pPr>
+      <w:r>
+        <w:t>Certificaciones</w:t>
+      </w:r>
+    </w:p>
+    <w:p>
+      <w:pPr>
+        <w:pStyle w:val="ListBullet2"/>
+        <w:ind w:left="720"/>
+      </w:pPr>
+      <w:r>
+        <w:t>Historial</w:t>
+      </w:r>
+    </w:p>
+    <w:p>
+      <w:pPr>
         <w:pStyle w:val="ListBullet"/>
       </w:pPr>
       <w:r>
@@ -5222,6 +8842,60 @@
     </w:p>
     <w:p>
       <w:pPr>
+        <w:pStyle w:val="ListBullet2"/>
+        <w:ind w:left="720"/>
+      </w:pPr>
+      <w:r>
+        <w:t>Seguros</w:t>
+      </w:r>
+    </w:p>
+    <w:p>
+      <w:pPr>
+        <w:pStyle w:val="ListBullet2"/>
+        <w:ind w:left="720"/>
+      </w:pPr>
+      <w:r>
+        <w:t>Alimentacion</w:t>
+      </w:r>
+    </w:p>
+    <w:p>
+      <w:pPr>
+        <w:pStyle w:val="ListBullet2"/>
+        <w:ind w:left="720"/>
+      </w:pPr>
+      <w:r>
+        <w:t>Transporte</w:t>
+      </w:r>
+    </w:p>
+    <w:p>
+      <w:pPr>
+        <w:pStyle w:val="ListBullet2"/>
+        <w:ind w:left="720"/>
+      </w:pPr>
+      <w:r>
+        <w:t>Bonos</w:t>
+      </w:r>
+    </w:p>
+    <w:p>
+      <w:pPr>
+        <w:pStyle w:val="ListBullet2"/>
+        <w:ind w:left="720"/>
+      </w:pPr>
+      <w:r>
+        <w:t>Beneficios corporativos</w:t>
+      </w:r>
+    </w:p>
+    <w:p>
+      <w:pPr>
+        <w:pStyle w:val="ListBullet2"/>
+        <w:ind w:left="720"/>
+      </w:pPr>
+      <w:r>
+        <w:t>Asignaciones</w:t>
+      </w:r>
+    </w:p>
+    <w:p>
+      <w:pPr>
         <w:pStyle w:val="ListBullet"/>
       </w:pPr>
       <w:r>
@@ -5230,6 +8904,78 @@
     </w:p>
     <w:p>
       <w:pPr>
+        <w:pStyle w:val="ListBullet2"/>
+        <w:ind w:left="720"/>
+      </w:pPr>
+      <w:r>
+        <w:t>Equipos</w:t>
+      </w:r>
+    </w:p>
+    <w:p>
+      <w:pPr>
+        <w:pStyle w:val="ListBullet2"/>
+        <w:ind w:left="720"/>
+      </w:pPr>
+      <w:r>
+        <w:t>Computadoras</w:t>
+      </w:r>
+    </w:p>
+    <w:p>
+      <w:pPr>
+        <w:pStyle w:val="ListBullet2"/>
+        <w:ind w:left="720"/>
+      </w:pPr>
+      <w:r>
+        <w:t>Celulares</w:t>
+      </w:r>
+    </w:p>
+    <w:p>
+      <w:pPr>
+        <w:pStyle w:val="ListBullet2"/>
+        <w:ind w:left="720"/>
+      </w:pPr>
+      <w:r>
+        <w:t>Uniformes</w:t>
+      </w:r>
+    </w:p>
+    <w:p>
+      <w:pPr>
+        <w:pStyle w:val="ListBullet2"/>
+        <w:ind w:left="720"/>
+      </w:pPr>
+      <w:r>
+        <w:t>Herramientas</w:t>
+      </w:r>
+    </w:p>
+    <w:p>
+      <w:pPr>
+        <w:pStyle w:val="ListBullet2"/>
+        <w:ind w:left="720"/>
+      </w:pPr>
+      <w:r>
+        <w:t>Vehiculos</w:t>
+      </w:r>
+    </w:p>
+    <w:p>
+      <w:pPr>
+        <w:pStyle w:val="ListBullet2"/>
+        <w:ind w:left="720"/>
+      </w:pPr>
+      <w:r>
+        <w:t>Asignaciones</w:t>
+      </w:r>
+    </w:p>
+    <w:p>
+      <w:pPr>
+        <w:pStyle w:val="ListBullet2"/>
+        <w:ind w:left="720"/>
+      </w:pPr>
+      <w:r>
+        <w:t>Devoluciones</w:t>
+      </w:r>
+    </w:p>
+    <w:p>
+      <w:pPr>
         <w:pStyle w:val="ListBullet"/>
       </w:pPr>
       <w:r>
@@ -5238,6 +8984,69 @@
     </w:p>
     <w:p>
       <w:pPr>
+        <w:pStyle w:val="ListBullet2"/>
+        <w:ind w:left="720"/>
+      </w:pPr>
+      <w:r>
+        <w:t>Renuncia</w:t>
+      </w:r>
+    </w:p>
+    <w:p>
+      <w:pPr>
+        <w:pStyle w:val="ListBullet2"/>
+        <w:ind w:left="720"/>
+      </w:pPr>
+      <w:r>
+        <w:t>Terminacion</w:t>
+      </w:r>
+    </w:p>
+    <w:p>
+      <w:pPr>
+        <w:pStyle w:val="ListBullet2"/>
+        <w:ind w:left="720"/>
+      </w:pPr>
+      <w:r>
+        <w:t>Despido</w:t>
+      </w:r>
+    </w:p>
+    <w:p>
+      <w:pPr>
+        <w:pStyle w:val="ListBullet2"/>
+        <w:ind w:left="720"/>
+      </w:pPr>
+      <w:r>
+        <w:t>Checklist de salida</w:t>
+      </w:r>
+    </w:p>
+    <w:p>
+      <w:pPr>
+        <w:pStyle w:val="ListBullet2"/>
+        <w:ind w:left="720"/>
+      </w:pPr>
+      <w:r>
+        <w:t>Devolucion de activos</w:t>
+      </w:r>
+    </w:p>
+    <w:p>
+      <w:pPr>
+        <w:pStyle w:val="ListBullet2"/>
+        <w:ind w:left="720"/>
+      </w:pPr>
+      <w:r>
+        <w:t>Liquidacion</w:t>
+      </w:r>
+    </w:p>
+    <w:p>
+      <w:pPr>
+        <w:pStyle w:val="ListBullet2"/>
+        <w:ind w:left="720"/>
+      </w:pPr>
+      <w:r>
+        <w:t>Entrevista de salida</w:t>
+      </w:r>
+    </w:p>
+    <w:p>
+      <w:pPr>
         <w:pStyle w:val="ListBullet"/>
       </w:pPr>
       <w:r>
@@ -5246,6 +9055,78 @@
     </w:p>
     <w:p>
       <w:pPr>
+        <w:pStyle w:val="ListBullet2"/>
+        <w:ind w:left="720"/>
+      </w:pPr>
+      <w:r>
+        <w:t>Mi perfil</w:t>
+      </w:r>
+    </w:p>
+    <w:p>
+      <w:pPr>
+        <w:pStyle w:val="ListBullet2"/>
+        <w:ind w:left="720"/>
+      </w:pPr>
+      <w:r>
+        <w:t>Mis documentos</w:t>
+      </w:r>
+    </w:p>
+    <w:p>
+      <w:pPr>
+        <w:pStyle w:val="ListBullet2"/>
+        <w:ind w:left="720"/>
+      </w:pPr>
+      <w:r>
+        <w:t>Mis boletas</w:t>
+      </w:r>
+    </w:p>
+    <w:p>
+      <w:pPr>
+        <w:pStyle w:val="ListBullet2"/>
+        <w:ind w:left="720"/>
+      </w:pPr>
+      <w:r>
+        <w:t>Mis asistencias</w:t>
+      </w:r>
+    </w:p>
+    <w:p>
+      <w:pPr>
+        <w:pStyle w:val="ListBullet2"/>
+        <w:ind w:left="720"/>
+      </w:pPr>
+      <w:r>
+        <w:t>Mis vacaciones</w:t>
+      </w:r>
+    </w:p>
+    <w:p>
+      <w:pPr>
+        <w:pStyle w:val="ListBullet2"/>
+        <w:ind w:left="720"/>
+      </w:pPr>
+      <w:r>
+        <w:t>Mis permisos</w:t>
+      </w:r>
+    </w:p>
+    <w:p>
+      <w:pPr>
+        <w:pStyle w:val="ListBullet2"/>
+        <w:ind w:left="720"/>
+      </w:pPr>
+      <w:r>
+        <w:t>Mis solicitudes</w:t>
+      </w:r>
+    </w:p>
+    <w:p>
+      <w:pPr>
+        <w:pStyle w:val="ListBullet2"/>
+        <w:ind w:left="720"/>
+      </w:pPr>
+      <w:r>
+        <w:t>Mis beneficios</w:t>
+      </w:r>
+    </w:p>
+    <w:p>
+      <w:pPr>
         <w:pStyle w:val="ListBullet"/>
       </w:pPr>
       <w:r>
@@ -5254,6 +9135,69 @@
     </w:p>
     <w:p>
       <w:pPr>
+        <w:pStyle w:val="ListBullet2"/>
+        <w:ind w:left="720"/>
+      </w:pPr>
+      <w:r>
+        <w:t>Equipo</w:t>
+      </w:r>
+    </w:p>
+    <w:p>
+      <w:pPr>
+        <w:pStyle w:val="ListBullet2"/>
+        <w:ind w:left="720"/>
+      </w:pPr>
+      <w:r>
+        <w:t>Aprobaciones</w:t>
+      </w:r>
+    </w:p>
+    <w:p>
+      <w:pPr>
+        <w:pStyle w:val="ListBullet2"/>
+        <w:ind w:left="720"/>
+      </w:pPr>
+      <w:r>
+        <w:t>Vacaciones</w:t>
+      </w:r>
+    </w:p>
+    <w:p>
+      <w:pPr>
+        <w:pStyle w:val="ListBullet2"/>
+        <w:ind w:left="720"/>
+      </w:pPr>
+      <w:r>
+        <w:t>Permisos</w:t>
+      </w:r>
+    </w:p>
+    <w:p>
+      <w:pPr>
+        <w:pStyle w:val="ListBullet2"/>
+        <w:ind w:left="720"/>
+      </w:pPr>
+      <w:r>
+        <w:t>Horas extras</w:t>
+      </w:r>
+    </w:p>
+    <w:p>
+      <w:pPr>
+        <w:pStyle w:val="ListBullet2"/>
+        <w:ind w:left="720"/>
+      </w:pPr>
+      <w:r>
+        <w:t>Asistencia</w:t>
+      </w:r>
+    </w:p>
+    <w:p>
+      <w:pPr>
+        <w:pStyle w:val="ListBullet2"/>
+        <w:ind w:left="720"/>
+      </w:pPr>
+      <w:r>
+        <w:t>Evaluaciones</w:t>
+      </w:r>
+    </w:p>
+    <w:p>
+      <w:pPr>
         <w:pStyle w:val="ListBullet"/>
       </w:pPr>
       <w:r>
@@ -5262,10 +9206,262 @@
     </w:p>
     <w:p>
       <w:pPr>
+        <w:pStyle w:val="ListBullet2"/>
+        <w:ind w:left="720"/>
+      </w:pPr>
+      <w:r>
+        <w:t>Headcount</w:t>
+      </w:r>
+    </w:p>
+    <w:p>
+      <w:pPr>
+        <w:pStyle w:val="ListBullet2"/>
+        <w:ind w:left="720"/>
+      </w:pPr>
+      <w:r>
+        <w:t>Rotacion</w:t>
+      </w:r>
+    </w:p>
+    <w:p>
+      <w:pPr>
+        <w:pStyle w:val="ListBullet2"/>
+        <w:ind w:left="720"/>
+      </w:pPr>
+      <w:r>
+        <w:t>Ausentismo</w:t>
+      </w:r>
+    </w:p>
+    <w:p>
+      <w:pPr>
+        <w:pStyle w:val="ListBullet2"/>
+        <w:ind w:left="720"/>
+      </w:pPr>
+      <w:r>
+        <w:t>Horas extras</w:t>
+      </w:r>
+    </w:p>
+    <w:p>
+      <w:pPr>
+        <w:pStyle w:val="ListBullet2"/>
+        <w:ind w:left="720"/>
+      </w:pPr>
+      <w:r>
+        <w:t>Costos laborales</w:t>
+      </w:r>
+    </w:p>
+    <w:p>
+      <w:pPr>
+        <w:pStyle w:val="ListBullet2"/>
+        <w:ind w:left="720"/>
+      </w:pPr>
+      <w:r>
+        <w:t>Vacaciones</w:t>
+      </w:r>
+    </w:p>
+    <w:p>
+      <w:pPr>
+        <w:pStyle w:val="ListBullet2"/>
+        <w:ind w:left="720"/>
+      </w:pPr>
+      <w:r>
+        <w:t>Nomina</w:t>
+      </w:r>
+    </w:p>
+    <w:p>
+      <w:pPr>
+        <w:pStyle w:val="ListBullet2"/>
+        <w:ind w:left="720"/>
+      </w:pPr>
+      <w:r>
+        <w:t>Desempeno</w:t>
+      </w:r>
+    </w:p>
+    <w:p>
+      <w:pPr>
+        <w:pStyle w:val="ListBullet2"/>
+        <w:ind w:left="720"/>
+      </w:pPr>
+      <w:r>
+        <w:t>Reclutamiento</w:t>
+      </w:r>
+    </w:p>
+    <w:p>
+      <w:pPr>
         <w:pStyle w:val="ListBullet"/>
       </w:pPr>
       <w:r>
         <w:t>Configuraciones</w:t>
+      </w:r>
+    </w:p>
+    <w:p>
+      <w:pPr>
+        <w:pStyle w:val="ListBullet2"/>
+        <w:ind w:left="720"/>
+      </w:pPr>
+      <w:r>
+        <w:t>Usuarios</w:t>
+      </w:r>
+    </w:p>
+    <w:p>
+      <w:pPr>
+        <w:pStyle w:val="ListBullet2"/>
+        <w:ind w:left="720"/>
+      </w:pPr>
+      <w:r>
+        <w:t>Roles</w:t>
+      </w:r>
+    </w:p>
+    <w:p>
+      <w:pPr>
+        <w:pStyle w:val="ListBullet2"/>
+        <w:ind w:left="720"/>
+      </w:pPr>
+      <w:r>
+        <w:t>Permisos</w:t>
+      </w:r>
+    </w:p>
+    <w:p>
+      <w:pPr>
+        <w:pStyle w:val="ListBullet2"/>
+        <w:ind w:left="720"/>
+      </w:pPr>
+      <w:r>
+        <w:t>Flujos de aprobacion</w:t>
+      </w:r>
+    </w:p>
+    <w:p>
+      <w:pPr>
+        <w:pStyle w:val="ListBullet2"/>
+        <w:ind w:left="720"/>
+      </w:pPr>
+      <w:r>
+        <w:t>Auditoria</w:t>
+      </w:r>
+    </w:p>
+    <w:p>
+      <w:pPr>
+        <w:pStyle w:val="ListBullet2"/>
+        <w:ind w:left="720"/>
+      </w:pPr>
+      <w:r>
+        <w:t>Bitacora de cambios</w:t>
+      </w:r>
+    </w:p>
+    <w:p>
+      <w:pPr>
+        <w:pStyle w:val="ListBullet2"/>
+        <w:ind w:left="720"/>
+      </w:pPr>
+      <w:r>
+        <w:t>Parametros de RRHH</w:t>
+      </w:r>
+    </w:p>
+    <w:p>
+      <w:pPr>
+        <w:pStyle w:val="ListBullet2"/>
+        <w:ind w:left="720"/>
+      </w:pPr>
+      <w:r>
+        <w:t>Empresas</w:t>
+      </w:r>
+    </w:p>
+    <w:p>
+      <w:pPr>
+        <w:pStyle w:val="ListBullet2"/>
+        <w:ind w:left="720"/>
+      </w:pPr>
+      <w:r>
+        <w:t>Sucursales</w:t>
+      </w:r>
+    </w:p>
+    <w:p>
+      <w:pPr>
+        <w:pStyle w:val="ListBullet2"/>
+        <w:ind w:left="720"/>
+      </w:pPr>
+      <w:r>
+        <w:t>Areas</w:t>
+      </w:r>
+    </w:p>
+    <w:p>
+      <w:pPr>
+        <w:pStyle w:val="ListBullet2"/>
+        <w:ind w:left="720"/>
+      </w:pPr>
+      <w:r>
+        <w:t>Departamentos</w:t>
+      </w:r>
+    </w:p>
+    <w:p>
+      <w:pPr>
+        <w:pStyle w:val="ListBullet2"/>
+        <w:ind w:left="720"/>
+      </w:pPr>
+      <w:r>
+        <w:t>Puestos</w:t>
+      </w:r>
+    </w:p>
+    <w:p>
+      <w:pPr>
+        <w:pStyle w:val="ListBullet2"/>
+        <w:ind w:left="720"/>
+      </w:pPr>
+      <w:r>
+        <w:t>Cargos</w:t>
+      </w:r>
+    </w:p>
+    <w:p>
+      <w:pPr>
+        <w:pStyle w:val="ListBullet2"/>
+        <w:ind w:left="720"/>
+      </w:pPr>
+      <w:r>
+        <w:t>Centros de costo</w:t>
+      </w:r>
+    </w:p>
+    <w:p>
+      <w:pPr>
+        <w:pStyle w:val="ListBullet2"/>
+        <w:ind w:left="720"/>
+      </w:pPr>
+      <w:r>
+        <w:t>Tipos de contrato</w:t>
+      </w:r>
+    </w:p>
+    <w:p>
+      <w:pPr>
+        <w:pStyle w:val="ListBullet2"/>
+        <w:ind w:left="720"/>
+      </w:pPr>
+      <w:r>
+        <w:t>Tipos de permiso</w:t>
+      </w:r>
+    </w:p>
+    <w:p>
+      <w:pPr>
+        <w:pStyle w:val="ListBullet2"/>
+        <w:ind w:left="720"/>
+      </w:pPr>
+      <w:r>
+        <w:t>Tipos de licencia</w:t>
+      </w:r>
+    </w:p>
+    <w:p>
+      <w:pPr>
+        <w:pStyle w:val="ListBullet2"/>
+        <w:ind w:left="720"/>
+      </w:pPr>
+      <w:r>
+        <w:t>Conceptos de nomina</w:t>
+      </w:r>
+    </w:p>
+    <w:p>
+      <w:pPr>
+        <w:pStyle w:val="ListBullet2"/>
+        <w:ind w:left="720"/>
+      </w:pPr>
+      <w:r>
+        <w:t>Estados del empleado</w:t>
       </w:r>
     </w:p>
     <w:sectPr>

</xml_diff>